<commit_message>
Bo khoi ngay thang va ky ten cuoi Loi cam doan
Chi bo bon dong theo yeu cau sinh vien; giu nguyen noi dung loi cam doan va 59 trang con lai. Dong bo Word/PDF 60 trang. Ma/test/input tai C khong doi.
</commit_message>
<xml_diff>
--- a/N24DCDT100_DT084_LuongMinhTruc_BaoCao.docx
+++ b/N24DCDT100_DT084_LuongMinhTruc_BaoCao.docx
@@ -678,35 +678,7 @@
           <w:rFonts w:ascii="Times New Roman" w:hAnsi="Times New Roman"/>
           <w:sz w:val="32"/>
         </w:rPr>
-        <w:t>PHI</w:t>
-      </w:r>
-      <w:r>
-        <w:rPr>
-          <w:rFonts w:ascii="Times New Roman" w:hAnsi="Times New Roman"/>
-          <w:sz w:val="32"/>
-        </w:rPr>
-        <w:t>Ế</w:t>
-      </w:r>
-      <w:r>
-        <w:rPr>
-          <w:rFonts w:ascii="Times New Roman" w:hAnsi="Times New Roman"/>
-          <w:sz w:val="32"/>
-        </w:rPr>
-        <w:t>U GIAO Đ</w:t>
-      </w:r>
-      <w:r>
-        <w:rPr>
-          <w:rFonts w:ascii="Times New Roman" w:hAnsi="Times New Roman"/>
-          <w:sz w:val="32"/>
-        </w:rPr>
-        <w:t>Ề</w:t>
-      </w:r>
-      <w:r>
-        <w:rPr>
-          <w:rFonts w:ascii="Times New Roman" w:hAnsi="Times New Roman"/>
-          <w:sz w:val="32"/>
-        </w:rPr>
-        <w:t xml:space="preserve"> TÀI</w:t>
+        <w:t>PHIẾU GIAO ĐỀ TÀI</w:t>
       </w:r>
     </w:p>
     <w:p>
@@ -1089,63 +1061,7 @@
           <w:sz w:val="32"/>
         </w:rPr>
         <w:lastRenderedPageBreak/>
-        <w:t>DT084 HƯ</w:t>
-      </w:r>
-      <w:r>
-        <w:rPr>
-          <w:rFonts w:ascii="Times New Roman" w:hAnsi="Times New Roman"/>
-          <w:sz w:val="32"/>
-        </w:rPr>
-        <w:t>Ớ</w:t>
-      </w:r>
-      <w:r>
-        <w:rPr>
-          <w:rFonts w:ascii="Times New Roman" w:hAnsi="Times New Roman"/>
-          <w:sz w:val="32"/>
-        </w:rPr>
-        <w:t>NG D</w:t>
-      </w:r>
-      <w:r>
-        <w:rPr>
-          <w:rFonts w:ascii="Times New Roman" w:hAnsi="Times New Roman"/>
-          <w:sz w:val="32"/>
-        </w:rPr>
-        <w:t>Ẫ</w:t>
-      </w:r>
-      <w:r>
-        <w:rPr>
-          <w:rFonts w:ascii="Times New Roman" w:hAnsi="Times New Roman"/>
-          <w:sz w:val="32"/>
-        </w:rPr>
-        <w:t>N TH</w:t>
-      </w:r>
-      <w:r>
-        <w:rPr>
-          <w:rFonts w:ascii="Times New Roman" w:hAnsi="Times New Roman"/>
-          <w:sz w:val="32"/>
-        </w:rPr>
-        <w:t>Ự</w:t>
-      </w:r>
-      <w:r>
-        <w:rPr>
-          <w:rFonts w:ascii="Times New Roman" w:hAnsi="Times New Roman"/>
-          <w:sz w:val="32"/>
-        </w:rPr>
-        <w:t>C HI</w:t>
-      </w:r>
-      <w:r>
-        <w:rPr>
-          <w:rFonts w:ascii="Times New Roman" w:hAnsi="Times New Roman"/>
-          <w:sz w:val="32"/>
-        </w:rPr>
-        <w:t>Ệ</w:t>
-      </w:r>
-      <w:r>
-        <w:rPr>
-          <w:rFonts w:ascii="Times New Roman" w:hAnsi="Times New Roman"/>
-          <w:sz w:val="32"/>
-        </w:rPr>
-        <w:t>N</w:t>
+        <w:t>DT084 HƯỚNG DẪN THỰC HIỆN</w:t>
       </w:r>
     </w:p>
     <w:p>
@@ -1561,7 +1477,7 @@
       <w:pPr>
         <w:pStyle w:val="TableCaption"/>
       </w:pPr>
-      <w:bookmarkStart w:id="0" w:name="_Toc244102520"/>
+      <w:bookmarkStart w:id="0" w:name="_Toc244113289"/>
       <w:r>
         <w:rPr>
           <w:b w:val="0"/>
@@ -2303,7 +2219,7 @@
       <w:pPr>
         <w:pStyle w:val="TableCaption"/>
       </w:pPr>
-      <w:bookmarkStart w:id="1" w:name="_Toc244102521"/>
+      <w:bookmarkStart w:id="1" w:name="_Toc244113290"/>
       <w:r>
         <w:rPr>
           <w:b w:val="0"/>
@@ -2693,42 +2609,6 @@
     </w:p>
     <w:p>
       <w:pPr>
-        <w:pStyle w:val="Nidung"/>
-        <w:jc w:val="right"/>
-      </w:pPr>
-      <w:r>
-        <w:t>TP. Hồ Chí Minh, ngày 28 tháng 10 năm 2026</w:t>
-      </w:r>
-    </w:p>
-    <w:p>
-      <w:pPr>
-        <w:pStyle w:val="Nidung"/>
-        <w:jc w:val="right"/>
-      </w:pPr>
-      <w:r>
-        <w:t>Sinh viên thực hiện</w:t>
-      </w:r>
-    </w:p>
-    <w:p>
-      <w:pPr>
-        <w:pStyle w:val="Nidung"/>
-        <w:jc w:val="right"/>
-      </w:pPr>
-      <w:r>
-        <w:t>(Ký và ghi rõ họ tên)</w:t>
-      </w:r>
-    </w:p>
-    <w:p>
-      <w:pPr>
-        <w:pStyle w:val="Nidung"/>
-        <w:jc w:val="right"/>
-      </w:pPr>
-      <w:r>
-        <w:t>Lương Minh Trực</w:t>
-      </w:r>
-    </w:p>
-    <w:p>
-      <w:pPr>
         <w:pStyle w:val="FrontTitle"/>
       </w:pPr>
       <w:r>
@@ -2840,7 +2720,7 @@
       <w:r>
         <w:fldChar w:fldCharType="separate"/>
       </w:r>
-      <w:hyperlink w:anchor="_Toc244102455" w:history="1">
+      <w:hyperlink w:anchor="_Toc244113224" w:history="1">
         <w:r>
           <w:rPr>
             <w:rStyle w:val="Hyperlink"/>
@@ -2868,7 +2748,7 @@
             <w:noProof/>
             <w:webHidden/>
           </w:rPr>
-          <w:instrText xml:space="preserve"> PAGEREF _Toc244102455 \h </w:instrText>
+          <w:instrText xml:space="preserve"> PAGEREF _Toc244113224 \h </w:instrText>
         </w:r>
         <w:r>
           <w:rPr>
@@ -2916,7 +2796,7 @@
           <w14:ligatures w14:val="standardContextual"/>
         </w:rPr>
       </w:pPr>
-      <w:hyperlink w:anchor="_Toc244102456" w:history="1">
+      <w:hyperlink w:anchor="_Toc244113225" w:history="1">
         <w:r>
           <w:rPr>
             <w:rStyle w:val="Hyperlink"/>
@@ -2944,7 +2824,7 @@
             <w:noProof/>
             <w:webHidden/>
           </w:rPr>
-          <w:instrText xml:space="preserve"> PAGEREF _Toc244102456 \h </w:instrText>
+          <w:instrText xml:space="preserve"> PAGEREF _Toc244113225 \h </w:instrText>
         </w:r>
         <w:r>
           <w:rPr>
@@ -2992,7 +2872,7 @@
           <w14:ligatures w14:val="standardContextual"/>
         </w:rPr>
       </w:pPr>
-      <w:hyperlink w:anchor="_Toc244102457" w:history="1">
+      <w:hyperlink w:anchor="_Toc244113226" w:history="1">
         <w:r>
           <w:rPr>
             <w:rStyle w:val="Hyperlink"/>
@@ -3020,7 +2900,7 @@
             <w:noProof/>
             <w:webHidden/>
           </w:rPr>
-          <w:instrText xml:space="preserve"> PAGEREF _Toc244102457 \h </w:instrText>
+          <w:instrText xml:space="preserve"> PAGEREF _Toc244113226 \h </w:instrText>
         </w:r>
         <w:r>
           <w:rPr>
@@ -3068,7 +2948,7 @@
           <w14:ligatures w14:val="standardContextual"/>
         </w:rPr>
       </w:pPr>
-      <w:hyperlink w:anchor="_Toc244102458" w:history="1">
+      <w:hyperlink w:anchor="_Toc244113227" w:history="1">
         <w:r>
           <w:rPr>
             <w:rStyle w:val="Hyperlink"/>
@@ -3096,7 +2976,7 @@
             <w:noProof/>
             <w:webHidden/>
           </w:rPr>
-          <w:instrText xml:space="preserve"> PAGEREF _Toc244102458 \h </w:instrText>
+          <w:instrText xml:space="preserve"> PAGEREF _Toc244113227 \h </w:instrText>
         </w:r>
         <w:r>
           <w:rPr>
@@ -3144,7 +3024,7 @@
           <w14:ligatures w14:val="standardContextual"/>
         </w:rPr>
       </w:pPr>
-      <w:hyperlink w:anchor="_Toc244102459" w:history="1">
+      <w:hyperlink w:anchor="_Toc244113228" w:history="1">
         <w:r>
           <w:rPr>
             <w:rStyle w:val="Hyperlink"/>
@@ -3172,7 +3052,7 @@
             <w:noProof/>
             <w:webHidden/>
           </w:rPr>
-          <w:instrText xml:space="preserve"> PAGEREF _Toc244102459 \h </w:instrText>
+          <w:instrText xml:space="preserve"> PAGEREF _Toc244113228 \h </w:instrText>
         </w:r>
         <w:r>
           <w:rPr>
@@ -3220,7 +3100,7 @@
           <w14:ligatures w14:val="standardContextual"/>
         </w:rPr>
       </w:pPr>
-      <w:hyperlink w:anchor="_Toc244102460" w:history="1">
+      <w:hyperlink w:anchor="_Toc244113229" w:history="1">
         <w:r>
           <w:rPr>
             <w:rStyle w:val="Hyperlink"/>
@@ -3248,7 +3128,7 @@
             <w:noProof/>
             <w:webHidden/>
           </w:rPr>
-          <w:instrText xml:space="preserve"> PAGEREF _Toc244102460 \h </w:instrText>
+          <w:instrText xml:space="preserve"> PAGEREF _Toc244113229 \h </w:instrText>
         </w:r>
         <w:r>
           <w:rPr>
@@ -3296,7 +3176,7 @@
           <w14:ligatures w14:val="standardContextual"/>
         </w:rPr>
       </w:pPr>
-      <w:hyperlink w:anchor="_Toc244102461" w:history="1">
+      <w:hyperlink w:anchor="_Toc244113230" w:history="1">
         <w:r>
           <w:rPr>
             <w:rStyle w:val="Hyperlink"/>
@@ -3324,7 +3204,7 @@
             <w:noProof/>
             <w:webHidden/>
           </w:rPr>
-          <w:instrText xml:space="preserve"> PAGEREF _Toc244102461 \h </w:instrText>
+          <w:instrText xml:space="preserve"> PAGEREF _Toc244113230 \h </w:instrText>
         </w:r>
         <w:r>
           <w:rPr>
@@ -3372,7 +3252,7 @@
           <w14:ligatures w14:val="standardContextual"/>
         </w:rPr>
       </w:pPr>
-      <w:hyperlink w:anchor="_Toc244102462" w:history="1">
+      <w:hyperlink w:anchor="_Toc244113231" w:history="1">
         <w:r>
           <w:rPr>
             <w:rStyle w:val="Hyperlink"/>
@@ -3400,7 +3280,7 @@
             <w:noProof/>
             <w:webHidden/>
           </w:rPr>
-          <w:instrText xml:space="preserve"> PAGEREF _Toc244102462 \h </w:instrText>
+          <w:instrText xml:space="preserve"> PAGEREF _Toc244113231 \h </w:instrText>
         </w:r>
         <w:r>
           <w:rPr>
@@ -3448,7 +3328,7 @@
           <w14:ligatures w14:val="standardContextual"/>
         </w:rPr>
       </w:pPr>
-      <w:hyperlink w:anchor="_Toc244102463" w:history="1">
+      <w:hyperlink w:anchor="_Toc244113232" w:history="1">
         <w:r>
           <w:rPr>
             <w:rStyle w:val="Hyperlink"/>
@@ -3476,7 +3356,7 @@
             <w:noProof/>
             <w:webHidden/>
           </w:rPr>
-          <w:instrText xml:space="preserve"> PAGEREF _Toc244102463 \h </w:instrText>
+          <w:instrText xml:space="preserve"> PAGEREF _Toc244113232 \h </w:instrText>
         </w:r>
         <w:r>
           <w:rPr>
@@ -3524,7 +3404,7 @@
           <w14:ligatures w14:val="standardContextual"/>
         </w:rPr>
       </w:pPr>
-      <w:hyperlink w:anchor="_Toc244102464" w:history="1">
+      <w:hyperlink w:anchor="_Toc244113233" w:history="1">
         <w:r>
           <w:rPr>
             <w:rStyle w:val="Hyperlink"/>
@@ -3552,7 +3432,7 @@
             <w:noProof/>
             <w:webHidden/>
           </w:rPr>
-          <w:instrText xml:space="preserve"> PAGEREF _Toc244102464 \h </w:instrText>
+          <w:instrText xml:space="preserve"> PAGEREF _Toc244113233 \h </w:instrText>
         </w:r>
         <w:r>
           <w:rPr>
@@ -3600,7 +3480,7 @@
           <w14:ligatures w14:val="standardContextual"/>
         </w:rPr>
       </w:pPr>
-      <w:hyperlink w:anchor="_Toc244102465" w:history="1">
+      <w:hyperlink w:anchor="_Toc244113234" w:history="1">
         <w:r>
           <w:rPr>
             <w:rStyle w:val="Hyperlink"/>
@@ -3628,7 +3508,7 @@
             <w:noProof/>
             <w:webHidden/>
           </w:rPr>
-          <w:instrText xml:space="preserve"> PAGEREF _Toc244102465 \h </w:instrText>
+          <w:instrText xml:space="preserve"> PAGEREF _Toc244113234 \h </w:instrText>
         </w:r>
         <w:r>
           <w:rPr>
@@ -3676,7 +3556,7 @@
           <w14:ligatures w14:val="standardContextual"/>
         </w:rPr>
       </w:pPr>
-      <w:hyperlink w:anchor="_Toc244102466" w:history="1">
+      <w:hyperlink w:anchor="_Toc244113235" w:history="1">
         <w:r>
           <w:rPr>
             <w:rStyle w:val="Hyperlink"/>
@@ -3704,7 +3584,7 @@
             <w:noProof/>
             <w:webHidden/>
           </w:rPr>
-          <w:instrText xml:space="preserve"> PAGEREF _Toc244102466 \h </w:instrText>
+          <w:instrText xml:space="preserve"> PAGEREF _Toc244113235 \h </w:instrText>
         </w:r>
         <w:r>
           <w:rPr>
@@ -3752,7 +3632,7 @@
           <w14:ligatures w14:val="standardContextual"/>
         </w:rPr>
       </w:pPr>
-      <w:hyperlink w:anchor="_Toc244102467" w:history="1">
+      <w:hyperlink w:anchor="_Toc244113236" w:history="1">
         <w:r>
           <w:rPr>
             <w:rStyle w:val="Hyperlink"/>
@@ -3780,7 +3660,7 @@
             <w:noProof/>
             <w:webHidden/>
           </w:rPr>
-          <w:instrText xml:space="preserve"> PAGEREF _Toc244102467 \h </w:instrText>
+          <w:instrText xml:space="preserve"> PAGEREF _Toc244113236 \h </w:instrText>
         </w:r>
         <w:r>
           <w:rPr>
@@ -3828,7 +3708,7 @@
           <w14:ligatures w14:val="standardContextual"/>
         </w:rPr>
       </w:pPr>
-      <w:hyperlink w:anchor="_Toc244102468" w:history="1">
+      <w:hyperlink w:anchor="_Toc244113237" w:history="1">
         <w:r>
           <w:rPr>
             <w:rStyle w:val="Hyperlink"/>
@@ -3856,7 +3736,7 @@
             <w:noProof/>
             <w:webHidden/>
           </w:rPr>
-          <w:instrText xml:space="preserve"> PAGEREF _Toc244102468 \h </w:instrText>
+          <w:instrText xml:space="preserve"> PAGEREF _Toc244113237 \h </w:instrText>
         </w:r>
         <w:r>
           <w:rPr>
@@ -3904,7 +3784,7 @@
           <w14:ligatures w14:val="standardContextual"/>
         </w:rPr>
       </w:pPr>
-      <w:hyperlink w:anchor="_Toc244102469" w:history="1">
+      <w:hyperlink w:anchor="_Toc244113238" w:history="1">
         <w:r>
           <w:rPr>
             <w:rStyle w:val="Hyperlink"/>
@@ -3932,7 +3812,7 @@
             <w:noProof/>
             <w:webHidden/>
           </w:rPr>
-          <w:instrText xml:space="preserve"> PAGEREF _Toc244102469 \h </w:instrText>
+          <w:instrText xml:space="preserve"> PAGEREF _Toc244113238 \h </w:instrText>
         </w:r>
         <w:r>
           <w:rPr>
@@ -3980,7 +3860,7 @@
           <w14:ligatures w14:val="standardContextual"/>
         </w:rPr>
       </w:pPr>
-      <w:hyperlink w:anchor="_Toc244102470" w:history="1">
+      <w:hyperlink w:anchor="_Toc244113239" w:history="1">
         <w:r>
           <w:rPr>
             <w:rStyle w:val="Hyperlink"/>
@@ -4008,7 +3888,7 @@
             <w:noProof/>
             <w:webHidden/>
           </w:rPr>
-          <w:instrText xml:space="preserve"> PAGEREF _Toc244102470 \h </w:instrText>
+          <w:instrText xml:space="preserve"> PAGEREF _Toc244113239 \h </w:instrText>
         </w:r>
         <w:r>
           <w:rPr>
@@ -4056,7 +3936,7 @@
           <w14:ligatures w14:val="standardContextual"/>
         </w:rPr>
       </w:pPr>
-      <w:hyperlink w:anchor="_Toc244102471" w:history="1">
+      <w:hyperlink w:anchor="_Toc244113240" w:history="1">
         <w:r>
           <w:rPr>
             <w:rStyle w:val="Hyperlink"/>
@@ -4084,7 +3964,7 @@
             <w:noProof/>
             <w:webHidden/>
           </w:rPr>
-          <w:instrText xml:space="preserve"> PAGEREF _Toc244102471 \h </w:instrText>
+          <w:instrText xml:space="preserve"> PAGEREF _Toc244113240 \h </w:instrText>
         </w:r>
         <w:r>
           <w:rPr>
@@ -4132,7 +4012,7 @@
           <w14:ligatures w14:val="standardContextual"/>
         </w:rPr>
       </w:pPr>
-      <w:hyperlink w:anchor="_Toc244102472" w:history="1">
+      <w:hyperlink w:anchor="_Toc244113241" w:history="1">
         <w:r>
           <w:rPr>
             <w:rStyle w:val="Hyperlink"/>
@@ -4160,7 +4040,7 @@
             <w:noProof/>
             <w:webHidden/>
           </w:rPr>
-          <w:instrText xml:space="preserve"> PAGEREF _Toc244102472 \h </w:instrText>
+          <w:instrText xml:space="preserve"> PAGEREF _Toc244113241 \h </w:instrText>
         </w:r>
         <w:r>
           <w:rPr>
@@ -4208,7 +4088,7 @@
           <w14:ligatures w14:val="standardContextual"/>
         </w:rPr>
       </w:pPr>
-      <w:hyperlink w:anchor="_Toc244102473" w:history="1">
+      <w:hyperlink w:anchor="_Toc244113242" w:history="1">
         <w:r>
           <w:rPr>
             <w:rStyle w:val="Hyperlink"/>
@@ -4236,7 +4116,7 @@
             <w:noProof/>
             <w:webHidden/>
           </w:rPr>
-          <w:instrText xml:space="preserve"> PAGEREF _Toc244102473 \h </w:instrText>
+          <w:instrText xml:space="preserve"> PAGEREF _Toc244113242 \h </w:instrText>
         </w:r>
         <w:r>
           <w:rPr>
@@ -4284,7 +4164,7 @@
           <w14:ligatures w14:val="standardContextual"/>
         </w:rPr>
       </w:pPr>
-      <w:hyperlink w:anchor="_Toc244102474" w:history="1">
+      <w:hyperlink w:anchor="_Toc244113243" w:history="1">
         <w:r>
           <w:rPr>
             <w:rStyle w:val="Hyperlink"/>
@@ -4312,7 +4192,7 @@
             <w:noProof/>
             <w:webHidden/>
           </w:rPr>
-          <w:instrText xml:space="preserve"> PAGEREF _Toc244102474 \h </w:instrText>
+          <w:instrText xml:space="preserve"> PAGEREF _Toc244113243 \h </w:instrText>
         </w:r>
         <w:r>
           <w:rPr>
@@ -4360,7 +4240,7 @@
           <w14:ligatures w14:val="standardContextual"/>
         </w:rPr>
       </w:pPr>
-      <w:hyperlink w:anchor="_Toc244102475" w:history="1">
+      <w:hyperlink w:anchor="_Toc244113244" w:history="1">
         <w:r>
           <w:rPr>
             <w:rStyle w:val="Hyperlink"/>
@@ -4388,7 +4268,7 @@
             <w:noProof/>
             <w:webHidden/>
           </w:rPr>
-          <w:instrText xml:space="preserve"> PAGEREF _Toc244102475 \h </w:instrText>
+          <w:instrText xml:space="preserve"> PAGEREF _Toc244113244 \h </w:instrText>
         </w:r>
         <w:r>
           <w:rPr>
@@ -4436,7 +4316,7 @@
           <w14:ligatures w14:val="standardContextual"/>
         </w:rPr>
       </w:pPr>
-      <w:hyperlink w:anchor="_Toc244102476" w:history="1">
+      <w:hyperlink w:anchor="_Toc244113245" w:history="1">
         <w:r>
           <w:rPr>
             <w:rStyle w:val="Hyperlink"/>
@@ -4464,7 +4344,7 @@
             <w:noProof/>
             <w:webHidden/>
           </w:rPr>
-          <w:instrText xml:space="preserve"> PAGEREF _Toc244102476 \h </w:instrText>
+          <w:instrText xml:space="preserve"> PAGEREF _Toc244113245 \h </w:instrText>
         </w:r>
         <w:r>
           <w:rPr>
@@ -4512,7 +4392,7 @@
           <w14:ligatures w14:val="standardContextual"/>
         </w:rPr>
       </w:pPr>
-      <w:hyperlink w:anchor="_Toc244102477" w:history="1">
+      <w:hyperlink w:anchor="_Toc244113246" w:history="1">
         <w:r>
           <w:rPr>
             <w:rStyle w:val="Hyperlink"/>
@@ -4540,7 +4420,7 @@
             <w:noProof/>
             <w:webHidden/>
           </w:rPr>
-          <w:instrText xml:space="preserve"> PAGEREF _Toc244102477 \h </w:instrText>
+          <w:instrText xml:space="preserve"> PAGEREF _Toc244113246 \h </w:instrText>
         </w:r>
         <w:r>
           <w:rPr>
@@ -4588,7 +4468,7 @@
           <w14:ligatures w14:val="standardContextual"/>
         </w:rPr>
       </w:pPr>
-      <w:hyperlink w:anchor="_Toc244102478" w:history="1">
+      <w:hyperlink w:anchor="_Toc244113247" w:history="1">
         <w:r>
           <w:rPr>
             <w:rStyle w:val="Hyperlink"/>
@@ -4616,7 +4496,7 @@
             <w:noProof/>
             <w:webHidden/>
           </w:rPr>
-          <w:instrText xml:space="preserve"> PAGEREF _Toc244102478 \h </w:instrText>
+          <w:instrText xml:space="preserve"> PAGEREF _Toc244113247 \h </w:instrText>
         </w:r>
         <w:r>
           <w:rPr>
@@ -4664,7 +4544,7 @@
           <w14:ligatures w14:val="standardContextual"/>
         </w:rPr>
       </w:pPr>
-      <w:hyperlink w:anchor="_Toc244102479" w:history="1">
+      <w:hyperlink w:anchor="_Toc244113248" w:history="1">
         <w:r>
           <w:rPr>
             <w:rStyle w:val="Hyperlink"/>
@@ -4692,7 +4572,7 @@
             <w:noProof/>
             <w:webHidden/>
           </w:rPr>
-          <w:instrText xml:space="preserve"> PAGEREF _Toc244102479 \h </w:instrText>
+          <w:instrText xml:space="preserve"> PAGEREF _Toc244113248 \h </w:instrText>
         </w:r>
         <w:r>
           <w:rPr>
@@ -4740,7 +4620,7 @@
           <w14:ligatures w14:val="standardContextual"/>
         </w:rPr>
       </w:pPr>
-      <w:hyperlink w:anchor="_Toc244102480" w:history="1">
+      <w:hyperlink w:anchor="_Toc244113249" w:history="1">
         <w:r>
           <w:rPr>
             <w:rStyle w:val="Hyperlink"/>
@@ -4768,7 +4648,7 @@
             <w:noProof/>
             <w:webHidden/>
           </w:rPr>
-          <w:instrText xml:space="preserve"> PAGEREF _Toc244102480 \h </w:instrText>
+          <w:instrText xml:space="preserve"> PAGEREF _Toc244113249 \h </w:instrText>
         </w:r>
         <w:r>
           <w:rPr>
@@ -4816,7 +4696,7 @@
           <w14:ligatures w14:val="standardContextual"/>
         </w:rPr>
       </w:pPr>
-      <w:hyperlink w:anchor="_Toc244102481" w:history="1">
+      <w:hyperlink w:anchor="_Toc244113250" w:history="1">
         <w:r>
           <w:rPr>
             <w:rStyle w:val="Hyperlink"/>
@@ -4844,7 +4724,7 @@
             <w:noProof/>
             <w:webHidden/>
           </w:rPr>
-          <w:instrText xml:space="preserve"> PAGEREF _Toc244102481 \h </w:instrText>
+          <w:instrText xml:space="preserve"> PAGEREF _Toc244113250 \h </w:instrText>
         </w:r>
         <w:r>
           <w:rPr>
@@ -4892,7 +4772,7 @@
           <w14:ligatures w14:val="standardContextual"/>
         </w:rPr>
       </w:pPr>
-      <w:hyperlink w:anchor="_Toc244102482" w:history="1">
+      <w:hyperlink w:anchor="_Toc244113251" w:history="1">
         <w:r>
           <w:rPr>
             <w:rStyle w:val="Hyperlink"/>
@@ -4920,7 +4800,7 @@
             <w:noProof/>
             <w:webHidden/>
           </w:rPr>
-          <w:instrText xml:space="preserve"> PAGEREF _Toc244102482 \h </w:instrText>
+          <w:instrText xml:space="preserve"> PAGEREF _Toc244113251 \h </w:instrText>
         </w:r>
         <w:r>
           <w:rPr>
@@ -4968,7 +4848,7 @@
           <w14:ligatures w14:val="standardContextual"/>
         </w:rPr>
       </w:pPr>
-      <w:hyperlink w:anchor="_Toc244102483" w:history="1">
+      <w:hyperlink w:anchor="_Toc244113252" w:history="1">
         <w:r>
           <w:rPr>
             <w:rStyle w:val="Hyperlink"/>
@@ -4996,7 +4876,7 @@
             <w:noProof/>
             <w:webHidden/>
           </w:rPr>
-          <w:instrText xml:space="preserve"> PAGEREF _Toc244102483 \h </w:instrText>
+          <w:instrText xml:space="preserve"> PAGEREF _Toc244113252 \h </w:instrText>
         </w:r>
         <w:r>
           <w:rPr>
@@ -5044,7 +4924,7 @@
           <w14:ligatures w14:val="standardContextual"/>
         </w:rPr>
       </w:pPr>
-      <w:hyperlink w:anchor="_Toc244102484" w:history="1">
+      <w:hyperlink w:anchor="_Toc244113253" w:history="1">
         <w:r>
           <w:rPr>
             <w:rStyle w:val="Hyperlink"/>
@@ -5072,7 +4952,7 @@
             <w:noProof/>
             <w:webHidden/>
           </w:rPr>
-          <w:instrText xml:space="preserve"> PAGEREF _Toc244102484 \h </w:instrText>
+          <w:instrText xml:space="preserve"> PAGEREF _Toc244113253 \h </w:instrText>
         </w:r>
         <w:r>
           <w:rPr>
@@ -5120,7 +5000,7 @@
           <w14:ligatures w14:val="standardContextual"/>
         </w:rPr>
       </w:pPr>
-      <w:hyperlink w:anchor="_Toc244102485" w:history="1">
+      <w:hyperlink w:anchor="_Toc244113254" w:history="1">
         <w:r>
           <w:rPr>
             <w:rStyle w:val="Hyperlink"/>
@@ -5148,7 +5028,7 @@
             <w:noProof/>
             <w:webHidden/>
           </w:rPr>
-          <w:instrText xml:space="preserve"> PAGEREF _Toc244102485 \h </w:instrText>
+          <w:instrText xml:space="preserve"> PAGEREF _Toc244113254 \h </w:instrText>
         </w:r>
         <w:r>
           <w:rPr>
@@ -5196,7 +5076,7 @@
           <w14:ligatures w14:val="standardContextual"/>
         </w:rPr>
       </w:pPr>
-      <w:hyperlink w:anchor="_Toc244102486" w:history="1">
+      <w:hyperlink w:anchor="_Toc244113255" w:history="1">
         <w:r>
           <w:rPr>
             <w:rStyle w:val="Hyperlink"/>
@@ -5224,7 +5104,7 @@
             <w:noProof/>
             <w:webHidden/>
           </w:rPr>
-          <w:instrText xml:space="preserve"> PAGEREF _Toc244102486 \h </w:instrText>
+          <w:instrText xml:space="preserve"> PAGEREF _Toc244113255 \h </w:instrText>
         </w:r>
         <w:r>
           <w:rPr>
@@ -5272,7 +5152,7 @@
           <w14:ligatures w14:val="standardContextual"/>
         </w:rPr>
       </w:pPr>
-      <w:hyperlink w:anchor="_Toc244102487" w:history="1">
+      <w:hyperlink w:anchor="_Toc244113256" w:history="1">
         <w:r>
           <w:rPr>
             <w:rStyle w:val="Hyperlink"/>
@@ -5300,7 +5180,7 @@
             <w:noProof/>
             <w:webHidden/>
           </w:rPr>
-          <w:instrText xml:space="preserve"> PAGEREF _Toc244102487 \h </w:instrText>
+          <w:instrText xml:space="preserve"> PAGEREF _Toc244113256 \h </w:instrText>
         </w:r>
         <w:r>
           <w:rPr>
@@ -5348,7 +5228,7 @@
           <w14:ligatures w14:val="standardContextual"/>
         </w:rPr>
       </w:pPr>
-      <w:hyperlink w:anchor="_Toc244102488" w:history="1">
+      <w:hyperlink w:anchor="_Toc244113257" w:history="1">
         <w:r>
           <w:rPr>
             <w:rStyle w:val="Hyperlink"/>
@@ -5376,7 +5256,7 @@
             <w:noProof/>
             <w:webHidden/>
           </w:rPr>
-          <w:instrText xml:space="preserve"> PAGEREF _Toc244102488 \h </w:instrText>
+          <w:instrText xml:space="preserve"> PAGEREF _Toc244113257 \h </w:instrText>
         </w:r>
         <w:r>
           <w:rPr>
@@ -5424,7 +5304,7 @@
           <w14:ligatures w14:val="standardContextual"/>
         </w:rPr>
       </w:pPr>
-      <w:hyperlink w:anchor="_Toc244102489" w:history="1">
+      <w:hyperlink w:anchor="_Toc244113258" w:history="1">
         <w:r>
           <w:rPr>
             <w:rStyle w:val="Hyperlink"/>
@@ -5452,7 +5332,7 @@
             <w:noProof/>
             <w:webHidden/>
           </w:rPr>
-          <w:instrText xml:space="preserve"> PAGEREF _Toc244102489 \h </w:instrText>
+          <w:instrText xml:space="preserve"> PAGEREF _Toc244113258 \h </w:instrText>
         </w:r>
         <w:r>
           <w:rPr>
@@ -5500,7 +5380,7 @@
           <w14:ligatures w14:val="standardContextual"/>
         </w:rPr>
       </w:pPr>
-      <w:hyperlink w:anchor="_Toc244102490" w:history="1">
+      <w:hyperlink w:anchor="_Toc244113259" w:history="1">
         <w:r>
           <w:rPr>
             <w:rStyle w:val="Hyperlink"/>
@@ -5528,7 +5408,7 @@
             <w:noProof/>
             <w:webHidden/>
           </w:rPr>
-          <w:instrText xml:space="preserve"> PAGEREF _Toc244102490 \h </w:instrText>
+          <w:instrText xml:space="preserve"> PAGEREF _Toc244113259 \h </w:instrText>
         </w:r>
         <w:r>
           <w:rPr>
@@ -5576,7 +5456,7 @@
           <w14:ligatures w14:val="standardContextual"/>
         </w:rPr>
       </w:pPr>
-      <w:hyperlink w:anchor="_Toc244102491" w:history="1">
+      <w:hyperlink w:anchor="_Toc244113260" w:history="1">
         <w:r>
           <w:rPr>
             <w:rStyle w:val="Hyperlink"/>
@@ -5604,7 +5484,7 @@
             <w:noProof/>
             <w:webHidden/>
           </w:rPr>
-          <w:instrText xml:space="preserve"> PAGEREF _Toc244102491 \h </w:instrText>
+          <w:instrText xml:space="preserve"> PAGEREF _Toc244113260 \h </w:instrText>
         </w:r>
         <w:r>
           <w:rPr>
@@ -5652,7 +5532,7 @@
           <w14:ligatures w14:val="standardContextual"/>
         </w:rPr>
       </w:pPr>
-      <w:hyperlink w:anchor="_Toc244102492" w:history="1">
+      <w:hyperlink w:anchor="_Toc244113261" w:history="1">
         <w:r>
           <w:rPr>
             <w:rStyle w:val="Hyperlink"/>
@@ -5680,7 +5560,7 @@
             <w:noProof/>
             <w:webHidden/>
           </w:rPr>
-          <w:instrText xml:space="preserve"> PAGEREF _Toc244102492 \h </w:instrText>
+          <w:instrText xml:space="preserve"> PAGEREF _Toc244113261 \h </w:instrText>
         </w:r>
         <w:r>
           <w:rPr>
@@ -5728,7 +5608,7 @@
           <w14:ligatures w14:val="standardContextual"/>
         </w:rPr>
       </w:pPr>
-      <w:hyperlink w:anchor="_Toc244102493" w:history="1">
+      <w:hyperlink w:anchor="_Toc244113262" w:history="1">
         <w:r>
           <w:rPr>
             <w:rStyle w:val="Hyperlink"/>
@@ -5756,7 +5636,7 @@
             <w:noProof/>
             <w:webHidden/>
           </w:rPr>
-          <w:instrText xml:space="preserve"> PAGEREF _Toc244102493 \h </w:instrText>
+          <w:instrText xml:space="preserve"> PAGEREF _Toc244113262 \h </w:instrText>
         </w:r>
         <w:r>
           <w:rPr>
@@ -5804,7 +5684,7 @@
           <w14:ligatures w14:val="standardContextual"/>
         </w:rPr>
       </w:pPr>
-      <w:hyperlink w:anchor="_Toc244102494" w:history="1">
+      <w:hyperlink w:anchor="_Toc244113263" w:history="1">
         <w:r>
           <w:rPr>
             <w:rStyle w:val="Hyperlink"/>
@@ -5832,7 +5712,7 @@
             <w:noProof/>
             <w:webHidden/>
           </w:rPr>
-          <w:instrText xml:space="preserve"> PAGEREF _Toc244102494 \h </w:instrText>
+          <w:instrText xml:space="preserve"> PAGEREF _Toc244113263 \h </w:instrText>
         </w:r>
         <w:r>
           <w:rPr>
@@ -5880,7 +5760,7 @@
           <w14:ligatures w14:val="standardContextual"/>
         </w:rPr>
       </w:pPr>
-      <w:hyperlink w:anchor="_Toc244102495" w:history="1">
+      <w:hyperlink w:anchor="_Toc244113264" w:history="1">
         <w:r>
           <w:rPr>
             <w:rStyle w:val="Hyperlink"/>
@@ -5908,7 +5788,7 @@
             <w:noProof/>
             <w:webHidden/>
           </w:rPr>
-          <w:instrText xml:space="preserve"> PAGEREF _Toc244102495 \h </w:instrText>
+          <w:instrText xml:space="preserve"> PAGEREF _Toc244113264 \h </w:instrText>
         </w:r>
         <w:r>
           <w:rPr>
@@ -5956,7 +5836,7 @@
           <w14:ligatures w14:val="standardContextual"/>
         </w:rPr>
       </w:pPr>
-      <w:hyperlink w:anchor="_Toc244102496" w:history="1">
+      <w:hyperlink w:anchor="_Toc244113265" w:history="1">
         <w:r>
           <w:rPr>
             <w:rStyle w:val="Hyperlink"/>
@@ -5984,7 +5864,7 @@
             <w:noProof/>
             <w:webHidden/>
           </w:rPr>
-          <w:instrText xml:space="preserve"> PAGEREF _Toc244102496 \h </w:instrText>
+          <w:instrText xml:space="preserve"> PAGEREF _Toc244113265 \h </w:instrText>
         </w:r>
         <w:r>
           <w:rPr>
@@ -6032,7 +5912,7 @@
           <w14:ligatures w14:val="standardContextual"/>
         </w:rPr>
       </w:pPr>
-      <w:hyperlink w:anchor="_Toc244102497" w:history="1">
+      <w:hyperlink w:anchor="_Toc244113266" w:history="1">
         <w:r>
           <w:rPr>
             <w:rStyle w:val="Hyperlink"/>
@@ -6060,7 +5940,7 @@
             <w:noProof/>
             <w:webHidden/>
           </w:rPr>
-          <w:instrText xml:space="preserve"> PAGEREF _Toc244102497 \h </w:instrText>
+          <w:instrText xml:space="preserve"> PAGEREF _Toc244113266 \h </w:instrText>
         </w:r>
         <w:r>
           <w:rPr>
@@ -6108,7 +5988,7 @@
           <w14:ligatures w14:val="standardContextual"/>
         </w:rPr>
       </w:pPr>
-      <w:hyperlink w:anchor="_Toc244102498" w:history="1">
+      <w:hyperlink w:anchor="_Toc244113267" w:history="1">
         <w:r>
           <w:rPr>
             <w:rStyle w:val="Hyperlink"/>
@@ -6136,7 +6016,7 @@
             <w:noProof/>
             <w:webHidden/>
           </w:rPr>
-          <w:instrText xml:space="preserve"> PAGEREF _Toc244102498 \h </w:instrText>
+          <w:instrText xml:space="preserve"> PAGEREF _Toc244113267 \h </w:instrText>
         </w:r>
         <w:r>
           <w:rPr>
@@ -6184,7 +6064,7 @@
           <w14:ligatures w14:val="standardContextual"/>
         </w:rPr>
       </w:pPr>
-      <w:hyperlink w:anchor="_Toc244102499" w:history="1">
+      <w:hyperlink w:anchor="_Toc244113268" w:history="1">
         <w:r>
           <w:rPr>
             <w:rStyle w:val="Hyperlink"/>
@@ -6212,7 +6092,7 @@
             <w:noProof/>
             <w:webHidden/>
           </w:rPr>
-          <w:instrText xml:space="preserve"> PAGEREF _Toc244102499 \h </w:instrText>
+          <w:instrText xml:space="preserve"> PAGEREF _Toc244113268 \h </w:instrText>
         </w:r>
         <w:r>
           <w:rPr>
@@ -6260,7 +6140,7 @@
           <w14:ligatures w14:val="standardContextual"/>
         </w:rPr>
       </w:pPr>
-      <w:hyperlink w:anchor="_Toc244102500" w:history="1">
+      <w:hyperlink w:anchor="_Toc244113269" w:history="1">
         <w:r>
           <w:rPr>
             <w:rStyle w:val="Hyperlink"/>
@@ -6288,7 +6168,7 @@
             <w:noProof/>
             <w:webHidden/>
           </w:rPr>
-          <w:instrText xml:space="preserve"> PAGEREF _Toc244102500 \h </w:instrText>
+          <w:instrText xml:space="preserve"> PAGEREF _Toc244113269 \h </w:instrText>
         </w:r>
         <w:r>
           <w:rPr>
@@ -6336,7 +6216,7 @@
           <w14:ligatures w14:val="standardContextual"/>
         </w:rPr>
       </w:pPr>
-      <w:hyperlink w:anchor="_Toc244102501" w:history="1">
+      <w:hyperlink w:anchor="_Toc244113270" w:history="1">
         <w:r>
           <w:rPr>
             <w:rStyle w:val="Hyperlink"/>
@@ -6364,7 +6244,7 @@
             <w:noProof/>
             <w:webHidden/>
           </w:rPr>
-          <w:instrText xml:space="preserve"> PAGEREF _Toc244102501 \h </w:instrText>
+          <w:instrText xml:space="preserve"> PAGEREF _Toc244113270 \h </w:instrText>
         </w:r>
         <w:r>
           <w:rPr>
@@ -6412,7 +6292,7 @@
           <w14:ligatures w14:val="standardContextual"/>
         </w:rPr>
       </w:pPr>
-      <w:hyperlink w:anchor="_Toc244102502" w:history="1">
+      <w:hyperlink w:anchor="_Toc244113271" w:history="1">
         <w:r>
           <w:rPr>
             <w:rStyle w:val="Hyperlink"/>
@@ -6440,7 +6320,7 @@
             <w:noProof/>
             <w:webHidden/>
           </w:rPr>
-          <w:instrText xml:space="preserve"> PAGEREF _Toc244102502 \h </w:instrText>
+          <w:instrText xml:space="preserve"> PAGEREF _Toc244113271 \h </w:instrText>
         </w:r>
         <w:r>
           <w:rPr>
@@ -6488,7 +6368,7 @@
           <w14:ligatures w14:val="standardContextual"/>
         </w:rPr>
       </w:pPr>
-      <w:hyperlink w:anchor="_Toc244102503" w:history="1">
+      <w:hyperlink w:anchor="_Toc244113272" w:history="1">
         <w:r>
           <w:rPr>
             <w:rStyle w:val="Hyperlink"/>
@@ -6516,7 +6396,7 @@
             <w:noProof/>
             <w:webHidden/>
           </w:rPr>
-          <w:instrText xml:space="preserve"> PAGEREF _Toc244102503 \h </w:instrText>
+          <w:instrText xml:space="preserve"> PAGEREF _Toc244113272 \h </w:instrText>
         </w:r>
         <w:r>
           <w:rPr>
@@ -6564,7 +6444,7 @@
           <w14:ligatures w14:val="standardContextual"/>
         </w:rPr>
       </w:pPr>
-      <w:hyperlink w:anchor="_Toc244102504" w:history="1">
+      <w:hyperlink w:anchor="_Toc244113273" w:history="1">
         <w:r>
           <w:rPr>
             <w:rStyle w:val="Hyperlink"/>
@@ -6592,7 +6472,7 @@
             <w:noProof/>
             <w:webHidden/>
           </w:rPr>
-          <w:instrText xml:space="preserve"> PAGEREF _Toc244102504 \h </w:instrText>
+          <w:instrText xml:space="preserve"> PAGEREF _Toc244113273 \h </w:instrText>
         </w:r>
         <w:r>
           <w:rPr>
@@ -6640,7 +6520,7 @@
           <w14:ligatures w14:val="standardContextual"/>
         </w:rPr>
       </w:pPr>
-      <w:hyperlink w:anchor="_Toc244102505" w:history="1">
+      <w:hyperlink w:anchor="_Toc244113274" w:history="1">
         <w:r>
           <w:rPr>
             <w:rStyle w:val="Hyperlink"/>
@@ -6668,7 +6548,7 @@
             <w:noProof/>
             <w:webHidden/>
           </w:rPr>
-          <w:instrText xml:space="preserve"> PAGEREF _Toc244102505 \h </w:instrText>
+          <w:instrText xml:space="preserve"> PAGEREF _Toc244113274 \h </w:instrText>
         </w:r>
         <w:r>
           <w:rPr>
@@ -6716,7 +6596,7 @@
           <w14:ligatures w14:val="standardContextual"/>
         </w:rPr>
       </w:pPr>
-      <w:hyperlink w:anchor="_Toc244102506" w:history="1">
+      <w:hyperlink w:anchor="_Toc244113275" w:history="1">
         <w:r>
           <w:rPr>
             <w:rStyle w:val="Hyperlink"/>
@@ -6744,7 +6624,7 @@
             <w:noProof/>
             <w:webHidden/>
           </w:rPr>
-          <w:instrText xml:space="preserve"> PAGEREF _Toc244102506 \h </w:instrText>
+          <w:instrText xml:space="preserve"> PAGEREF _Toc244113275 \h </w:instrText>
         </w:r>
         <w:r>
           <w:rPr>
@@ -6792,7 +6672,7 @@
           <w14:ligatures w14:val="standardContextual"/>
         </w:rPr>
       </w:pPr>
-      <w:hyperlink w:anchor="_Toc244102507" w:history="1">
+      <w:hyperlink w:anchor="_Toc244113276" w:history="1">
         <w:r>
           <w:rPr>
             <w:rStyle w:val="Hyperlink"/>
@@ -6820,7 +6700,7 @@
             <w:noProof/>
             <w:webHidden/>
           </w:rPr>
-          <w:instrText xml:space="preserve"> PAGEREF _Toc244102507 \h </w:instrText>
+          <w:instrText xml:space="preserve"> PAGEREF _Toc244113276 \h </w:instrText>
         </w:r>
         <w:r>
           <w:rPr>
@@ -6868,7 +6748,7 @@
           <w14:ligatures w14:val="standardContextual"/>
         </w:rPr>
       </w:pPr>
-      <w:hyperlink w:anchor="_Toc244102508" w:history="1">
+      <w:hyperlink w:anchor="_Toc244113277" w:history="1">
         <w:r>
           <w:rPr>
             <w:rStyle w:val="Hyperlink"/>
@@ -6896,7 +6776,7 @@
             <w:noProof/>
             <w:webHidden/>
           </w:rPr>
-          <w:instrText xml:space="preserve"> PAGEREF _Toc244102508 \h </w:instrText>
+          <w:instrText xml:space="preserve"> PAGEREF _Toc244113277 \h </w:instrText>
         </w:r>
         <w:r>
           <w:rPr>
@@ -6944,7 +6824,7 @@
           <w14:ligatures w14:val="standardContextual"/>
         </w:rPr>
       </w:pPr>
-      <w:hyperlink w:anchor="_Toc244102509" w:history="1">
+      <w:hyperlink w:anchor="_Toc244113278" w:history="1">
         <w:r>
           <w:rPr>
             <w:rStyle w:val="Hyperlink"/>
@@ -6972,7 +6852,7 @@
             <w:noProof/>
             <w:webHidden/>
           </w:rPr>
-          <w:instrText xml:space="preserve"> PAGEREF _Toc244102509 \h </w:instrText>
+          <w:instrText xml:space="preserve"> PAGEREF _Toc244113278 \h </w:instrText>
         </w:r>
         <w:r>
           <w:rPr>
@@ -7020,7 +6900,7 @@
           <w14:ligatures w14:val="standardContextual"/>
         </w:rPr>
       </w:pPr>
-      <w:hyperlink w:anchor="_Toc244102510" w:history="1">
+      <w:hyperlink w:anchor="_Toc244113279" w:history="1">
         <w:r>
           <w:rPr>
             <w:rStyle w:val="Hyperlink"/>
@@ -7048,7 +6928,7 @@
             <w:noProof/>
             <w:webHidden/>
           </w:rPr>
-          <w:instrText xml:space="preserve"> PAGEREF _Toc244102510 \h </w:instrText>
+          <w:instrText xml:space="preserve"> PAGEREF _Toc244113279 \h </w:instrText>
         </w:r>
         <w:r>
           <w:rPr>
@@ -7096,7 +6976,7 @@
           <w14:ligatures w14:val="standardContextual"/>
         </w:rPr>
       </w:pPr>
-      <w:hyperlink w:anchor="_Toc244102511" w:history="1">
+      <w:hyperlink w:anchor="_Toc244113280" w:history="1">
         <w:r>
           <w:rPr>
             <w:rStyle w:val="Hyperlink"/>
@@ -7124,7 +7004,7 @@
             <w:noProof/>
             <w:webHidden/>
           </w:rPr>
-          <w:instrText xml:space="preserve"> PAGEREF _Toc244102511 \h </w:instrText>
+          <w:instrText xml:space="preserve"> PAGEREF _Toc244113280 \h </w:instrText>
         </w:r>
         <w:r>
           <w:rPr>
@@ -7172,7 +7052,7 @@
           <w14:ligatures w14:val="standardContextual"/>
         </w:rPr>
       </w:pPr>
-      <w:hyperlink w:anchor="_Toc244102512" w:history="1">
+      <w:hyperlink w:anchor="_Toc244113281" w:history="1">
         <w:r>
           <w:rPr>
             <w:rStyle w:val="Hyperlink"/>
@@ -7200,7 +7080,7 @@
             <w:noProof/>
             <w:webHidden/>
           </w:rPr>
-          <w:instrText xml:space="preserve"> PAGEREF _Toc244102512 \h </w:instrText>
+          <w:instrText xml:space="preserve"> PAGEREF _Toc244113281 \h </w:instrText>
         </w:r>
         <w:r>
           <w:rPr>
@@ -7248,7 +7128,7 @@
           <w14:ligatures w14:val="standardContextual"/>
         </w:rPr>
       </w:pPr>
-      <w:hyperlink w:anchor="_Toc244102513" w:history="1">
+      <w:hyperlink w:anchor="_Toc244113282" w:history="1">
         <w:r>
           <w:rPr>
             <w:rStyle w:val="Hyperlink"/>
@@ -7276,7 +7156,7 @@
             <w:noProof/>
             <w:webHidden/>
           </w:rPr>
-          <w:instrText xml:space="preserve"> PAGEREF _Toc244102513 \h </w:instrText>
+          <w:instrText xml:space="preserve"> PAGEREF _Toc244113282 \h </w:instrText>
         </w:r>
         <w:r>
           <w:rPr>
@@ -7324,7 +7204,7 @@
           <w14:ligatures w14:val="standardContextual"/>
         </w:rPr>
       </w:pPr>
-      <w:hyperlink w:anchor="_Toc244102514" w:history="1">
+      <w:hyperlink w:anchor="_Toc244113283" w:history="1">
         <w:r>
           <w:rPr>
             <w:rStyle w:val="Hyperlink"/>
@@ -7352,7 +7232,7 @@
             <w:noProof/>
             <w:webHidden/>
           </w:rPr>
-          <w:instrText xml:space="preserve"> PAGEREF _Toc244102514 \h </w:instrText>
+          <w:instrText xml:space="preserve"> PAGEREF _Toc244113283 \h </w:instrText>
         </w:r>
         <w:r>
           <w:rPr>
@@ -7400,7 +7280,7 @@
           <w14:ligatures w14:val="standardContextual"/>
         </w:rPr>
       </w:pPr>
-      <w:hyperlink w:anchor="_Toc244102515" w:history="1">
+      <w:hyperlink w:anchor="_Toc244113284" w:history="1">
         <w:r>
           <w:rPr>
             <w:rStyle w:val="Hyperlink"/>
@@ -7428,7 +7308,7 @@
             <w:noProof/>
             <w:webHidden/>
           </w:rPr>
-          <w:instrText xml:space="preserve"> PAGEREF _Toc244102515 \h </w:instrText>
+          <w:instrText xml:space="preserve"> PAGEREF _Toc244113284 \h </w:instrText>
         </w:r>
         <w:r>
           <w:rPr>
@@ -7476,7 +7356,7 @@
           <w14:ligatures w14:val="standardContextual"/>
         </w:rPr>
       </w:pPr>
-      <w:hyperlink w:anchor="_Toc244102516" w:history="1">
+      <w:hyperlink w:anchor="_Toc244113285" w:history="1">
         <w:r>
           <w:rPr>
             <w:rStyle w:val="Hyperlink"/>
@@ -7504,7 +7384,7 @@
             <w:noProof/>
             <w:webHidden/>
           </w:rPr>
-          <w:instrText xml:space="preserve"> PAGEREF _Toc244102516 \h </w:instrText>
+          <w:instrText xml:space="preserve"> PAGEREF _Toc244113285 \h </w:instrText>
         </w:r>
         <w:r>
           <w:rPr>
@@ -7552,7 +7432,7 @@
           <w14:ligatures w14:val="standardContextual"/>
         </w:rPr>
       </w:pPr>
-      <w:hyperlink w:anchor="_Toc244102517" w:history="1">
+      <w:hyperlink w:anchor="_Toc244113286" w:history="1">
         <w:r>
           <w:rPr>
             <w:rStyle w:val="Hyperlink"/>
@@ -7580,7 +7460,7 @@
             <w:noProof/>
             <w:webHidden/>
           </w:rPr>
-          <w:instrText xml:space="preserve"> PAGEREF _Toc244102517 \h </w:instrText>
+          <w:instrText xml:space="preserve"> PAGEREF _Toc244113286 \h </w:instrText>
         </w:r>
         <w:r>
           <w:rPr>
@@ -7628,7 +7508,7 @@
           <w14:ligatures w14:val="standardContextual"/>
         </w:rPr>
       </w:pPr>
-      <w:hyperlink w:anchor="_Toc244102518" w:history="1">
+      <w:hyperlink w:anchor="_Toc244113287" w:history="1">
         <w:r>
           <w:rPr>
             <w:rStyle w:val="Hyperlink"/>
@@ -7656,7 +7536,7 @@
             <w:noProof/>
             <w:webHidden/>
           </w:rPr>
-          <w:instrText xml:space="preserve"> PAGEREF _Toc244102518 \h </w:instrText>
+          <w:instrText xml:space="preserve"> PAGEREF _Toc244113287 \h </w:instrText>
         </w:r>
         <w:r>
           <w:rPr>
@@ -7704,7 +7584,7 @@
           <w14:ligatures w14:val="standardContextual"/>
         </w:rPr>
       </w:pPr>
-      <w:hyperlink w:anchor="_Toc244102519" w:history="1">
+      <w:hyperlink w:anchor="_Toc244113288" w:history="1">
         <w:r>
           <w:rPr>
             <w:rStyle w:val="Hyperlink"/>
@@ -7732,7 +7612,7 @@
             <w:noProof/>
             <w:webHidden/>
           </w:rPr>
-          <w:instrText xml:space="preserve"> PAGEREF _Toc244102519 \h </w:instrText>
+          <w:instrText xml:space="preserve"> PAGEREF _Toc244113288 \h </w:instrText>
         </w:r>
         <w:r>
           <w:rPr>
@@ -7787,7 +7667,7 @@
       <w:pPr>
         <w:pStyle w:val="TableCaption"/>
       </w:pPr>
-      <w:bookmarkStart w:id="2" w:name="_Toc244102522"/>
+      <w:bookmarkStart w:id="2" w:name="_Toc244113291"/>
       <w:r>
         <w:rPr>
           <w:b w:val="0"/>
@@ -8441,7 +8321,7 @@
       <w:r>
         <w:fldChar w:fldCharType="separate"/>
       </w:r>
-      <w:hyperlink w:anchor="_Toc244102520" w:history="1">
+      <w:hyperlink w:anchor="_Toc244113289" w:history="1">
         <w:r>
           <w:rPr>
             <w:rStyle w:val="Hyperlink"/>
@@ -8469,7 +8349,7 @@
             <w:noProof/>
             <w:webHidden/>
           </w:rPr>
-          <w:instrText xml:space="preserve"> PAGEREF _Toc244102520 \h </w:instrText>
+          <w:instrText xml:space="preserve"> PAGEREF _Toc244113289 \h </w:instrText>
         </w:r>
         <w:r>
           <w:rPr>
@@ -8517,7 +8397,7 @@
           <w14:ligatures w14:val="standardContextual"/>
         </w:rPr>
       </w:pPr>
-      <w:hyperlink w:anchor="_Toc244102521" w:history="1">
+      <w:hyperlink w:anchor="_Toc244113290" w:history="1">
         <w:r>
           <w:rPr>
             <w:rStyle w:val="Hyperlink"/>
@@ -8545,7 +8425,7 @@
             <w:noProof/>
             <w:webHidden/>
           </w:rPr>
-          <w:instrText xml:space="preserve"> PAGEREF _Toc244102521 \h </w:instrText>
+          <w:instrText xml:space="preserve"> PAGEREF _Toc244113290 \h </w:instrText>
         </w:r>
         <w:r>
           <w:rPr>
@@ -8593,7 +8473,7 @@
           <w14:ligatures w14:val="standardContextual"/>
         </w:rPr>
       </w:pPr>
-      <w:hyperlink w:anchor="_Toc244102522" w:history="1">
+      <w:hyperlink w:anchor="_Toc244113291" w:history="1">
         <w:r>
           <w:rPr>
             <w:rStyle w:val="Hyperlink"/>
@@ -8621,7 +8501,7 @@
             <w:noProof/>
             <w:webHidden/>
           </w:rPr>
-          <w:instrText xml:space="preserve"> PAGEREF _Toc244102522 \h </w:instrText>
+          <w:instrText xml:space="preserve"> PAGEREF _Toc244113291 \h </w:instrText>
         </w:r>
         <w:r>
           <w:rPr>
@@ -8669,7 +8549,7 @@
           <w14:ligatures w14:val="standardContextual"/>
         </w:rPr>
       </w:pPr>
-      <w:hyperlink w:anchor="_Toc244102523" w:history="1">
+      <w:hyperlink w:anchor="_Toc244113292" w:history="1">
         <w:r>
           <w:rPr>
             <w:rStyle w:val="Hyperlink"/>
@@ -8697,7 +8577,7 @@
             <w:noProof/>
             <w:webHidden/>
           </w:rPr>
-          <w:instrText xml:space="preserve"> PAGEREF _Toc244102523 \h </w:instrText>
+          <w:instrText xml:space="preserve"> PAGEREF _Toc244113292 \h </w:instrText>
         </w:r>
         <w:r>
           <w:rPr>
@@ -8745,7 +8625,7 @@
           <w14:ligatures w14:val="standardContextual"/>
         </w:rPr>
       </w:pPr>
-      <w:hyperlink w:anchor="_Toc244102524" w:history="1">
+      <w:hyperlink w:anchor="_Toc244113293" w:history="1">
         <w:r>
           <w:rPr>
             <w:rStyle w:val="Hyperlink"/>
@@ -8773,7 +8653,7 @@
             <w:noProof/>
             <w:webHidden/>
           </w:rPr>
-          <w:instrText xml:space="preserve"> PAGEREF _Toc244102524 \h </w:instrText>
+          <w:instrText xml:space="preserve"> PAGEREF _Toc244113293 \h </w:instrText>
         </w:r>
         <w:r>
           <w:rPr>
@@ -8821,7 +8701,7 @@
           <w14:ligatures w14:val="standardContextual"/>
         </w:rPr>
       </w:pPr>
-      <w:hyperlink w:anchor="_Toc244102525" w:history="1">
+      <w:hyperlink w:anchor="_Toc244113294" w:history="1">
         <w:r>
           <w:rPr>
             <w:rStyle w:val="Hyperlink"/>
@@ -8849,7 +8729,7 @@
             <w:noProof/>
             <w:webHidden/>
           </w:rPr>
-          <w:instrText xml:space="preserve"> PAGEREF _Toc244102525 \h </w:instrText>
+          <w:instrText xml:space="preserve"> PAGEREF _Toc244113294 \h </w:instrText>
         </w:r>
         <w:r>
           <w:rPr>
@@ -8897,7 +8777,7 @@
           <w14:ligatures w14:val="standardContextual"/>
         </w:rPr>
       </w:pPr>
-      <w:hyperlink w:anchor="_Toc244102526" w:history="1">
+      <w:hyperlink w:anchor="_Toc244113295" w:history="1">
         <w:r>
           <w:rPr>
             <w:rStyle w:val="Hyperlink"/>
@@ -8925,7 +8805,7 @@
             <w:noProof/>
             <w:webHidden/>
           </w:rPr>
-          <w:instrText xml:space="preserve"> PAGEREF _Toc244102526 \h </w:instrText>
+          <w:instrText xml:space="preserve"> PAGEREF _Toc244113295 \h </w:instrText>
         </w:r>
         <w:r>
           <w:rPr>
@@ -8973,7 +8853,7 @@
           <w14:ligatures w14:val="standardContextual"/>
         </w:rPr>
       </w:pPr>
-      <w:hyperlink w:anchor="_Toc244102527" w:history="1">
+      <w:hyperlink w:anchor="_Toc244113296" w:history="1">
         <w:r>
           <w:rPr>
             <w:rStyle w:val="Hyperlink"/>
@@ -9001,7 +8881,7 @@
             <w:noProof/>
             <w:webHidden/>
           </w:rPr>
-          <w:instrText xml:space="preserve"> PAGEREF _Toc244102527 \h </w:instrText>
+          <w:instrText xml:space="preserve"> PAGEREF _Toc244113296 \h </w:instrText>
         </w:r>
         <w:r>
           <w:rPr>
@@ -9049,7 +8929,7 @@
           <w14:ligatures w14:val="standardContextual"/>
         </w:rPr>
       </w:pPr>
-      <w:hyperlink w:anchor="_Toc244102528" w:history="1">
+      <w:hyperlink w:anchor="_Toc244113297" w:history="1">
         <w:r>
           <w:rPr>
             <w:rStyle w:val="Hyperlink"/>
@@ -9077,7 +8957,7 @@
             <w:noProof/>
             <w:webHidden/>
           </w:rPr>
-          <w:instrText xml:space="preserve"> PAGEREF _Toc244102528 \h </w:instrText>
+          <w:instrText xml:space="preserve"> PAGEREF _Toc244113297 \h </w:instrText>
         </w:r>
         <w:r>
           <w:rPr>
@@ -9125,7 +9005,7 @@
           <w14:ligatures w14:val="standardContextual"/>
         </w:rPr>
       </w:pPr>
-      <w:hyperlink w:anchor="_Toc244102529" w:history="1">
+      <w:hyperlink w:anchor="_Toc244113298" w:history="1">
         <w:r>
           <w:rPr>
             <w:rStyle w:val="Hyperlink"/>
@@ -9153,7 +9033,7 @@
             <w:noProof/>
             <w:webHidden/>
           </w:rPr>
-          <w:instrText xml:space="preserve"> PAGEREF _Toc244102529 \h </w:instrText>
+          <w:instrText xml:space="preserve"> PAGEREF _Toc244113298 \h </w:instrText>
         </w:r>
         <w:r>
           <w:rPr>
@@ -9201,7 +9081,7 @@
           <w14:ligatures w14:val="standardContextual"/>
         </w:rPr>
       </w:pPr>
-      <w:hyperlink w:anchor="_Toc244102530" w:history="1">
+      <w:hyperlink w:anchor="_Toc244113299" w:history="1">
         <w:r>
           <w:rPr>
             <w:rStyle w:val="Hyperlink"/>
@@ -9229,7 +9109,7 @@
             <w:noProof/>
             <w:webHidden/>
           </w:rPr>
-          <w:instrText xml:space="preserve"> PAGEREF _Toc244102530 \h </w:instrText>
+          <w:instrText xml:space="preserve"> PAGEREF _Toc244113299 \h </w:instrText>
         </w:r>
         <w:r>
           <w:rPr>
@@ -9277,7 +9157,7 @@
           <w14:ligatures w14:val="standardContextual"/>
         </w:rPr>
       </w:pPr>
-      <w:hyperlink w:anchor="_Toc244102531" w:history="1">
+      <w:hyperlink w:anchor="_Toc244113300" w:history="1">
         <w:r>
           <w:rPr>
             <w:rStyle w:val="Hyperlink"/>
@@ -9305,7 +9185,7 @@
             <w:noProof/>
             <w:webHidden/>
           </w:rPr>
-          <w:instrText xml:space="preserve"> PAGEREF _Toc244102531 \h </w:instrText>
+          <w:instrText xml:space="preserve"> PAGEREF _Toc244113300 \h </w:instrText>
         </w:r>
         <w:r>
           <w:rPr>
@@ -9353,7 +9233,7 @@
           <w14:ligatures w14:val="standardContextual"/>
         </w:rPr>
       </w:pPr>
-      <w:hyperlink w:anchor="_Toc244102532" w:history="1">
+      <w:hyperlink w:anchor="_Toc244113301" w:history="1">
         <w:r>
           <w:rPr>
             <w:rStyle w:val="Hyperlink"/>
@@ -9381,7 +9261,7 @@
             <w:noProof/>
             <w:webHidden/>
           </w:rPr>
-          <w:instrText xml:space="preserve"> PAGEREF _Toc244102532 \h </w:instrText>
+          <w:instrText xml:space="preserve"> PAGEREF _Toc244113301 \h </w:instrText>
         </w:r>
         <w:r>
           <w:rPr>
@@ -9429,7 +9309,7 @@
           <w14:ligatures w14:val="standardContextual"/>
         </w:rPr>
       </w:pPr>
-      <w:hyperlink w:anchor="_Toc244102533" w:history="1">
+      <w:hyperlink w:anchor="_Toc244113302" w:history="1">
         <w:r>
           <w:rPr>
             <w:rStyle w:val="Hyperlink"/>
@@ -9457,7 +9337,7 @@
             <w:noProof/>
             <w:webHidden/>
           </w:rPr>
-          <w:instrText xml:space="preserve"> PAGEREF _Toc244102533 \h </w:instrText>
+          <w:instrText xml:space="preserve"> PAGEREF _Toc244113302 \h </w:instrText>
         </w:r>
         <w:r>
           <w:rPr>
@@ -9505,7 +9385,7 @@
           <w14:ligatures w14:val="standardContextual"/>
         </w:rPr>
       </w:pPr>
-      <w:hyperlink w:anchor="_Toc244102534" w:history="1">
+      <w:hyperlink w:anchor="_Toc244113303" w:history="1">
         <w:r>
           <w:rPr>
             <w:rStyle w:val="Hyperlink"/>
@@ -9533,7 +9413,7 @@
             <w:noProof/>
             <w:webHidden/>
           </w:rPr>
-          <w:instrText xml:space="preserve"> PAGEREF _Toc244102534 \h </w:instrText>
+          <w:instrText xml:space="preserve"> PAGEREF _Toc244113303 \h </w:instrText>
         </w:r>
         <w:r>
           <w:rPr>
@@ -9581,7 +9461,7 @@
           <w14:ligatures w14:val="standardContextual"/>
         </w:rPr>
       </w:pPr>
-      <w:hyperlink w:anchor="_Toc244102535" w:history="1">
+      <w:hyperlink w:anchor="_Toc244113304" w:history="1">
         <w:r>
           <w:rPr>
             <w:rStyle w:val="Hyperlink"/>
@@ -9609,7 +9489,7 @@
             <w:noProof/>
             <w:webHidden/>
           </w:rPr>
-          <w:instrText xml:space="preserve"> PAGEREF _Toc244102535 \h </w:instrText>
+          <w:instrText xml:space="preserve"> PAGEREF _Toc244113304 \h </w:instrText>
         </w:r>
         <w:r>
           <w:rPr>
@@ -9657,7 +9537,7 @@
           <w14:ligatures w14:val="standardContextual"/>
         </w:rPr>
       </w:pPr>
-      <w:hyperlink w:anchor="_Toc244102536" w:history="1">
+      <w:hyperlink w:anchor="_Toc244113305" w:history="1">
         <w:r>
           <w:rPr>
             <w:rStyle w:val="Hyperlink"/>
@@ -9685,7 +9565,7 @@
             <w:noProof/>
             <w:webHidden/>
           </w:rPr>
-          <w:instrText xml:space="preserve"> PAGEREF _Toc244102536 \h </w:instrText>
+          <w:instrText xml:space="preserve"> PAGEREF _Toc244113305 \h </w:instrText>
         </w:r>
         <w:r>
           <w:rPr>
@@ -9733,7 +9613,7 @@
           <w14:ligatures w14:val="standardContextual"/>
         </w:rPr>
       </w:pPr>
-      <w:hyperlink w:anchor="_Toc244102537" w:history="1">
+      <w:hyperlink w:anchor="_Toc244113306" w:history="1">
         <w:r>
           <w:rPr>
             <w:rStyle w:val="Hyperlink"/>
@@ -9761,7 +9641,7 @@
             <w:noProof/>
             <w:webHidden/>
           </w:rPr>
-          <w:instrText xml:space="preserve"> PAGEREF _Toc244102537 \h </w:instrText>
+          <w:instrText xml:space="preserve"> PAGEREF _Toc244113306 \h </w:instrText>
         </w:r>
         <w:r>
           <w:rPr>
@@ -9809,7 +9689,7 @@
           <w14:ligatures w14:val="standardContextual"/>
         </w:rPr>
       </w:pPr>
-      <w:hyperlink w:anchor="_Toc244102538" w:history="1">
+      <w:hyperlink w:anchor="_Toc244113307" w:history="1">
         <w:r>
           <w:rPr>
             <w:rStyle w:val="Hyperlink"/>
@@ -9837,7 +9717,7 @@
             <w:noProof/>
             <w:webHidden/>
           </w:rPr>
-          <w:instrText xml:space="preserve"> PAGEREF _Toc244102538 \h </w:instrText>
+          <w:instrText xml:space="preserve"> PAGEREF _Toc244113307 \h </w:instrText>
         </w:r>
         <w:r>
           <w:rPr>
@@ -9885,7 +9765,7 @@
           <w14:ligatures w14:val="standardContextual"/>
         </w:rPr>
       </w:pPr>
-      <w:hyperlink w:anchor="_Toc244102539" w:history="1">
+      <w:hyperlink w:anchor="_Toc244113308" w:history="1">
         <w:r>
           <w:rPr>
             <w:rStyle w:val="Hyperlink"/>
@@ -9913,7 +9793,7 @@
             <w:noProof/>
             <w:webHidden/>
           </w:rPr>
-          <w:instrText xml:space="preserve"> PAGEREF _Toc244102539 \h </w:instrText>
+          <w:instrText xml:space="preserve"> PAGEREF _Toc244113308 \h </w:instrText>
         </w:r>
         <w:r>
           <w:rPr>
@@ -9961,7 +9841,7 @@
           <w14:ligatures w14:val="standardContextual"/>
         </w:rPr>
       </w:pPr>
-      <w:hyperlink w:anchor="_Toc244102540" w:history="1">
+      <w:hyperlink w:anchor="_Toc244113309" w:history="1">
         <w:r>
           <w:rPr>
             <w:rStyle w:val="Hyperlink"/>
@@ -9989,7 +9869,7 @@
             <w:noProof/>
             <w:webHidden/>
           </w:rPr>
-          <w:instrText xml:space="preserve"> PAGEREF _Toc244102540 \h </w:instrText>
+          <w:instrText xml:space="preserve"> PAGEREF _Toc244113309 \h </w:instrText>
         </w:r>
         <w:r>
           <w:rPr>
@@ -10037,7 +9917,7 @@
           <w14:ligatures w14:val="standardContextual"/>
         </w:rPr>
       </w:pPr>
-      <w:hyperlink w:anchor="_Toc244102541" w:history="1">
+      <w:hyperlink w:anchor="_Toc244113310" w:history="1">
         <w:r>
           <w:rPr>
             <w:rStyle w:val="Hyperlink"/>
@@ -10065,7 +9945,7 @@
             <w:noProof/>
             <w:webHidden/>
           </w:rPr>
-          <w:instrText xml:space="preserve"> PAGEREF _Toc244102541 \h </w:instrText>
+          <w:instrText xml:space="preserve"> PAGEREF _Toc244113310 \h </w:instrText>
         </w:r>
         <w:r>
           <w:rPr>
@@ -10113,7 +9993,7 @@
           <w14:ligatures w14:val="standardContextual"/>
         </w:rPr>
       </w:pPr>
-      <w:hyperlink w:anchor="_Toc244102542" w:history="1">
+      <w:hyperlink w:anchor="_Toc244113311" w:history="1">
         <w:r>
           <w:rPr>
             <w:rStyle w:val="Hyperlink"/>
@@ -10141,7 +10021,7 @@
             <w:noProof/>
             <w:webHidden/>
           </w:rPr>
-          <w:instrText xml:space="preserve"> PAGEREF _Toc244102542 \h </w:instrText>
+          <w:instrText xml:space="preserve"> PAGEREF _Toc244113311 \h </w:instrText>
         </w:r>
         <w:r>
           <w:rPr>
@@ -10189,7 +10069,7 @@
           <w14:ligatures w14:val="standardContextual"/>
         </w:rPr>
       </w:pPr>
-      <w:hyperlink w:anchor="_Toc244102543" w:history="1">
+      <w:hyperlink w:anchor="_Toc244113312" w:history="1">
         <w:r>
           <w:rPr>
             <w:rStyle w:val="Hyperlink"/>
@@ -10217,7 +10097,7 @@
             <w:noProof/>
             <w:webHidden/>
           </w:rPr>
-          <w:instrText xml:space="preserve"> PAGEREF _Toc244102543 \h </w:instrText>
+          <w:instrText xml:space="preserve"> PAGEREF _Toc244113312 \h </w:instrText>
         </w:r>
         <w:r>
           <w:rPr>
@@ -10265,7 +10145,7 @@
           <w14:ligatures w14:val="standardContextual"/>
         </w:rPr>
       </w:pPr>
-      <w:hyperlink w:anchor="_Toc244102544" w:history="1">
+      <w:hyperlink w:anchor="_Toc244113313" w:history="1">
         <w:r>
           <w:rPr>
             <w:rStyle w:val="Hyperlink"/>
@@ -10293,7 +10173,7 @@
             <w:noProof/>
             <w:webHidden/>
           </w:rPr>
-          <w:instrText xml:space="preserve"> PAGEREF _Toc244102544 \h </w:instrText>
+          <w:instrText xml:space="preserve"> PAGEREF _Toc244113313 \h </w:instrText>
         </w:r>
         <w:r>
           <w:rPr>
@@ -10341,7 +10221,7 @@
           <w14:ligatures w14:val="standardContextual"/>
         </w:rPr>
       </w:pPr>
-      <w:hyperlink w:anchor="_Toc244102545" w:history="1">
+      <w:hyperlink w:anchor="_Toc244113314" w:history="1">
         <w:r>
           <w:rPr>
             <w:rStyle w:val="Hyperlink"/>
@@ -10369,7 +10249,7 @@
             <w:noProof/>
             <w:webHidden/>
           </w:rPr>
-          <w:instrText xml:space="preserve"> PAGEREF _Toc244102545 \h </w:instrText>
+          <w:instrText xml:space="preserve"> PAGEREF _Toc244113314 \h </w:instrText>
         </w:r>
         <w:r>
           <w:rPr>
@@ -10446,7 +10326,7 @@
       <w:r>
         <w:fldChar w:fldCharType="separate"/>
       </w:r>
-      <w:hyperlink w:anchor="_Toc244102546" w:history="1">
+      <w:hyperlink w:anchor="_Toc244113315" w:history="1">
         <w:r>
           <w:rPr>
             <w:rStyle w:val="Hyperlink"/>
@@ -10474,7 +10354,7 @@
             <w:noProof/>
             <w:webHidden/>
           </w:rPr>
-          <w:instrText xml:space="preserve"> PAGEREF _Toc244102546 \h </w:instrText>
+          <w:instrText xml:space="preserve"> PAGEREF _Toc244113315 \h </w:instrText>
         </w:r>
         <w:r>
           <w:rPr>
@@ -10522,7 +10402,7 @@
           <w14:ligatures w14:val="standardContextual"/>
         </w:rPr>
       </w:pPr>
-      <w:hyperlink w:anchor="_Toc244102547" w:history="1">
+      <w:hyperlink w:anchor="_Toc244113316" w:history="1">
         <w:r>
           <w:rPr>
             <w:rStyle w:val="Hyperlink"/>
@@ -10550,7 +10430,7 @@
             <w:noProof/>
             <w:webHidden/>
           </w:rPr>
-          <w:instrText xml:space="preserve"> PAGEREF _Toc244102547 \h </w:instrText>
+          <w:instrText xml:space="preserve"> PAGEREF _Toc244113316 \h </w:instrText>
         </w:r>
         <w:r>
           <w:rPr>
@@ -10598,7 +10478,7 @@
           <w14:ligatures w14:val="standardContextual"/>
         </w:rPr>
       </w:pPr>
-      <w:hyperlink w:anchor="_Toc244102548" w:history="1">
+      <w:hyperlink w:anchor="_Toc244113317" w:history="1">
         <w:r>
           <w:rPr>
             <w:rStyle w:val="Hyperlink"/>
@@ -10626,7 +10506,7 @@
             <w:noProof/>
             <w:webHidden/>
           </w:rPr>
-          <w:instrText xml:space="preserve"> PAGEREF _Toc244102548 \h </w:instrText>
+          <w:instrText xml:space="preserve"> PAGEREF _Toc244113317 \h </w:instrText>
         </w:r>
         <w:r>
           <w:rPr>
@@ -10674,7 +10554,7 @@
           <w14:ligatures w14:val="standardContextual"/>
         </w:rPr>
       </w:pPr>
-      <w:hyperlink w:anchor="_Toc244102549" w:history="1">
+      <w:hyperlink w:anchor="_Toc244113318" w:history="1">
         <w:r>
           <w:rPr>
             <w:rStyle w:val="Hyperlink"/>
@@ -10702,7 +10582,7 @@
             <w:noProof/>
             <w:webHidden/>
           </w:rPr>
-          <w:instrText xml:space="preserve"> PAGEREF _Toc244102549 \h </w:instrText>
+          <w:instrText xml:space="preserve"> PAGEREF _Toc244113318 \h </w:instrText>
         </w:r>
         <w:r>
           <w:rPr>
@@ -10750,7 +10630,7 @@
           <w14:ligatures w14:val="standardContextual"/>
         </w:rPr>
       </w:pPr>
-      <w:hyperlink w:anchor="_Toc244102550" w:history="1">
+      <w:hyperlink w:anchor="_Toc244113319" w:history="1">
         <w:r>
           <w:rPr>
             <w:rStyle w:val="Hyperlink"/>
@@ -10778,7 +10658,7 @@
             <w:noProof/>
             <w:webHidden/>
           </w:rPr>
-          <w:instrText xml:space="preserve"> PAGEREF _Toc244102550 \h </w:instrText>
+          <w:instrText xml:space="preserve"> PAGEREF _Toc244113319 \h </w:instrText>
         </w:r>
         <w:r>
           <w:rPr>
@@ -10826,7 +10706,7 @@
           <w14:ligatures w14:val="standardContextual"/>
         </w:rPr>
       </w:pPr>
-      <w:hyperlink w:anchor="_Toc244102551" w:history="1">
+      <w:hyperlink w:anchor="_Toc244113320" w:history="1">
         <w:r>
           <w:rPr>
             <w:rStyle w:val="Hyperlink"/>
@@ -10854,7 +10734,7 @@
             <w:noProof/>
             <w:webHidden/>
           </w:rPr>
-          <w:instrText xml:space="preserve"> PAGEREF _Toc244102551 \h </w:instrText>
+          <w:instrText xml:space="preserve"> PAGEREF _Toc244113320 \h </w:instrText>
         </w:r>
         <w:r>
           <w:rPr>
@@ -10902,7 +10782,7 @@
           <w14:ligatures w14:val="standardContextual"/>
         </w:rPr>
       </w:pPr>
-      <w:hyperlink w:anchor="_Toc244102552" w:history="1">
+      <w:hyperlink w:anchor="_Toc244113321" w:history="1">
         <w:r>
           <w:rPr>
             <w:rStyle w:val="Hyperlink"/>
@@ -10930,7 +10810,7 @@
             <w:noProof/>
             <w:webHidden/>
           </w:rPr>
-          <w:instrText xml:space="preserve"> PAGEREF _Toc244102552 \h </w:instrText>
+          <w:instrText xml:space="preserve"> PAGEREF _Toc244113321 \h </w:instrText>
         </w:r>
         <w:r>
           <w:rPr>
@@ -10978,7 +10858,7 @@
           <w14:ligatures w14:val="standardContextual"/>
         </w:rPr>
       </w:pPr>
-      <w:hyperlink w:anchor="_Toc244102553" w:history="1">
+      <w:hyperlink w:anchor="_Toc244113322" w:history="1">
         <w:r>
           <w:rPr>
             <w:rStyle w:val="Hyperlink"/>
@@ -11006,7 +10886,7 @@
             <w:noProof/>
             <w:webHidden/>
           </w:rPr>
-          <w:instrText xml:space="preserve"> PAGEREF _Toc244102553 \h </w:instrText>
+          <w:instrText xml:space="preserve"> PAGEREF _Toc244113322 \h </w:instrText>
         </w:r>
         <w:r>
           <w:rPr>
@@ -11054,7 +10934,7 @@
           <w14:ligatures w14:val="standardContextual"/>
         </w:rPr>
       </w:pPr>
-      <w:hyperlink w:anchor="_Toc244102554" w:history="1">
+      <w:hyperlink w:anchor="_Toc244113323" w:history="1">
         <w:r>
           <w:rPr>
             <w:rStyle w:val="Hyperlink"/>
@@ -11082,7 +10962,7 @@
             <w:noProof/>
             <w:webHidden/>
           </w:rPr>
-          <w:instrText xml:space="preserve"> PAGEREF _Toc244102554 \h </w:instrText>
+          <w:instrText xml:space="preserve"> PAGEREF _Toc244113323 \h </w:instrText>
         </w:r>
         <w:r>
           <w:rPr>
@@ -11130,7 +11010,7 @@
           <w14:ligatures w14:val="standardContextual"/>
         </w:rPr>
       </w:pPr>
-      <w:hyperlink w:anchor="_Toc244102555" w:history="1">
+      <w:hyperlink w:anchor="_Toc244113324" w:history="1">
         <w:r>
           <w:rPr>
             <w:rStyle w:val="Hyperlink"/>
@@ -11158,7 +11038,7 @@
             <w:noProof/>
             <w:webHidden/>
           </w:rPr>
-          <w:instrText xml:space="preserve"> PAGEREF _Toc244102555 \h </w:instrText>
+          <w:instrText xml:space="preserve"> PAGEREF _Toc244113324 \h </w:instrText>
         </w:r>
         <w:r>
           <w:rPr>
@@ -11206,7 +11086,7 @@
           <w14:ligatures w14:val="standardContextual"/>
         </w:rPr>
       </w:pPr>
-      <w:hyperlink w:anchor="_Toc244102556" w:history="1">
+      <w:hyperlink w:anchor="_Toc244113325" w:history="1">
         <w:r>
           <w:rPr>
             <w:rStyle w:val="Hyperlink"/>
@@ -11234,7 +11114,7 @@
             <w:noProof/>
             <w:webHidden/>
           </w:rPr>
-          <w:instrText xml:space="preserve"> PAGEREF _Toc244102556 \h </w:instrText>
+          <w:instrText xml:space="preserve"> PAGEREF _Toc244113325 \h </w:instrText>
         </w:r>
         <w:r>
           <w:rPr>
@@ -11289,7 +11169,7 @@
       <w:pPr>
         <w:pStyle w:val="Heading1"/>
       </w:pPr>
-      <w:bookmarkStart w:id="3" w:name="_Toc244102455"/>
+      <w:bookmarkStart w:id="3" w:name="_Toc244113224"/>
       <w:r>
         <w:rPr>
           <w:b w:val="0"/>
@@ -11303,7 +11183,7 @@
       <w:pPr>
         <w:pStyle w:val="Heading2"/>
       </w:pPr>
-      <w:bookmarkStart w:id="4" w:name="_Toc244102456"/>
+      <w:bookmarkStart w:id="4" w:name="_Toc244113225"/>
       <w:r>
         <w:rPr>
           <w:b w:val="0"/>
@@ -11340,7 +11220,7 @@
       <w:pPr>
         <w:pStyle w:val="Heading2"/>
       </w:pPr>
-      <w:bookmarkStart w:id="5" w:name="_Toc244102457"/>
+      <w:bookmarkStart w:id="5" w:name="_Toc244113226"/>
       <w:r>
         <w:rPr>
           <w:b w:val="0"/>
@@ -11353,7 +11233,7 @@
       <w:pPr>
         <w:pStyle w:val="TableCaption"/>
       </w:pPr>
-      <w:bookmarkStart w:id="6" w:name="_Toc244102523"/>
+      <w:bookmarkStart w:id="6" w:name="_Toc244113292"/>
       <w:r>
         <w:rPr>
           <w:b w:val="0"/>
@@ -11717,7 +11597,7 @@
       <w:pPr>
         <w:pStyle w:val="Heading2"/>
       </w:pPr>
-      <w:bookmarkStart w:id="7" w:name="_Toc244102458"/>
+      <w:bookmarkStart w:id="7" w:name="_Toc244113227"/>
       <w:r>
         <w:rPr>
           <w:b w:val="0"/>
@@ -11730,7 +11610,7 @@
       <w:pPr>
         <w:pStyle w:val="Heading3"/>
       </w:pPr>
-      <w:bookmarkStart w:id="8" w:name="_Toc244102459"/>
+      <w:bookmarkStart w:id="8" w:name="_Toc244113228"/>
       <w:r>
         <w:rPr>
           <w:b w:val="0"/>
@@ -11767,7 +11647,7 @@
       <w:pPr>
         <w:pStyle w:val="Heading3"/>
       </w:pPr>
-      <w:bookmarkStart w:id="9" w:name="_Toc244102460"/>
+      <w:bookmarkStart w:id="9" w:name="_Toc244113229"/>
       <w:r>
         <w:rPr>
           <w:b w:val="0"/>
@@ -11780,7 +11660,7 @@
       <w:pPr>
         <w:pStyle w:val="TableCaption"/>
       </w:pPr>
-      <w:bookmarkStart w:id="10" w:name="_Toc244102524"/>
+      <w:bookmarkStart w:id="10" w:name="_Toc244113293"/>
       <w:r>
         <w:rPr>
           <w:b w:val="0"/>
@@ -12225,7 +12105,7 @@
       <w:pPr>
         <w:pStyle w:val="TableCaption"/>
       </w:pPr>
-      <w:bookmarkStart w:id="11" w:name="_Toc244102525"/>
+      <w:bookmarkStart w:id="11" w:name="_Toc244113294"/>
       <w:r>
         <w:rPr>
           <w:b w:val="0"/>
@@ -12413,7 +12293,7 @@
       <w:pPr>
         <w:pStyle w:val="Heading2"/>
       </w:pPr>
-      <w:bookmarkStart w:id="12" w:name="_Toc244102461"/>
+      <w:bookmarkStart w:id="12" w:name="_Toc244113230"/>
       <w:r>
         <w:rPr>
           <w:b w:val="0"/>
@@ -12434,7 +12314,7 @@
       <w:pPr>
         <w:pStyle w:val="Heading1"/>
       </w:pPr>
-      <w:bookmarkStart w:id="13" w:name="_Toc244102462"/>
+      <w:bookmarkStart w:id="13" w:name="_Toc244113231"/>
       <w:r>
         <w:rPr>
           <w:b w:val="0"/>
@@ -12448,7 +12328,7 @@
       <w:pPr>
         <w:pStyle w:val="Heading2"/>
       </w:pPr>
-      <w:bookmarkStart w:id="14" w:name="_Toc244102463"/>
+      <w:bookmarkStart w:id="14" w:name="_Toc244113232"/>
       <w:r>
         <w:rPr>
           <w:b w:val="0"/>
@@ -12485,7 +12365,7 @@
       <w:pPr>
         <w:pStyle w:val="Heading2"/>
       </w:pPr>
-      <w:bookmarkStart w:id="15" w:name="_Toc244102464"/>
+      <w:bookmarkStart w:id="15" w:name="_Toc244113233"/>
       <w:r>
         <w:rPr>
           <w:b w:val="0"/>
@@ -12498,7 +12378,7 @@
       <w:pPr>
         <w:pStyle w:val="Heading3"/>
       </w:pPr>
-      <w:bookmarkStart w:id="16" w:name="_Toc244102465"/>
+      <w:bookmarkStart w:id="16" w:name="_Toc244113234"/>
       <w:r>
         <w:rPr>
           <w:b w:val="0"/>
@@ -12527,7 +12407,7 @@
       <w:pPr>
         <w:pStyle w:val="TableCaption"/>
       </w:pPr>
-      <w:bookmarkStart w:id="17" w:name="_Toc244102526"/>
+      <w:bookmarkStart w:id="17" w:name="_Toc244113295"/>
       <w:r>
         <w:rPr>
           <w:b w:val="0"/>
@@ -12796,7 +12676,7 @@
       <w:pPr>
         <w:pStyle w:val="Heading3"/>
       </w:pPr>
-      <w:bookmarkStart w:id="18" w:name="_Toc244102466"/>
+      <w:bookmarkStart w:id="18" w:name="_Toc244113235"/>
       <w:r>
         <w:rPr>
           <w:b w:val="0"/>
@@ -12825,7 +12705,7 @@
       <w:pPr>
         <w:pStyle w:val="TableCaption"/>
       </w:pPr>
-      <w:bookmarkStart w:id="19" w:name="_Toc244102527"/>
+      <w:bookmarkStart w:id="19" w:name="_Toc244113296"/>
       <w:r>
         <w:rPr>
           <w:b w:val="0"/>
@@ -13138,7 +13018,7 @@
       <w:pPr>
         <w:pStyle w:val="Heading2"/>
       </w:pPr>
-      <w:bookmarkStart w:id="20" w:name="_Toc244102467"/>
+      <w:bookmarkStart w:id="20" w:name="_Toc244113236"/>
       <w:r>
         <w:rPr>
           <w:b w:val="0"/>
@@ -13151,7 +13031,7 @@
       <w:pPr>
         <w:pStyle w:val="Heading3"/>
       </w:pPr>
-      <w:bookmarkStart w:id="21" w:name="_Toc244102468"/>
+      <w:bookmarkStart w:id="21" w:name="_Toc244113237"/>
       <w:r>
         <w:rPr>
           <w:b w:val="0"/>
@@ -13180,7 +13060,7 @@
       <w:pPr>
         <w:pStyle w:val="Heading3"/>
       </w:pPr>
-      <w:bookmarkStart w:id="22" w:name="_Toc244102469"/>
+      <w:bookmarkStart w:id="22" w:name="_Toc244113238"/>
       <w:r>
         <w:rPr>
           <w:b w:val="0"/>
@@ -13209,7 +13089,7 @@
       <w:pPr>
         <w:pStyle w:val="Heading2"/>
       </w:pPr>
-      <w:bookmarkStart w:id="23" w:name="_Toc244102470"/>
+      <w:bookmarkStart w:id="23" w:name="_Toc244113239"/>
       <w:r>
         <w:rPr>
           <w:b w:val="0"/>
@@ -13247,7 +13127,7 @@
       <w:pPr>
         <w:pStyle w:val="Heading1"/>
       </w:pPr>
-      <w:bookmarkStart w:id="24" w:name="_Toc244102471"/>
+      <w:bookmarkStart w:id="24" w:name="_Toc244113240"/>
       <w:r>
         <w:rPr>
           <w:b w:val="0"/>
@@ -13269,7 +13149,7 @@
       <w:pPr>
         <w:pStyle w:val="Heading2"/>
       </w:pPr>
-      <w:bookmarkStart w:id="25" w:name="_Toc244102472"/>
+      <w:bookmarkStart w:id="25" w:name="_Toc244113241"/>
       <w:r>
         <w:rPr>
           <w:b w:val="0"/>
@@ -13282,7 +13162,7 @@
       <w:pPr>
         <w:pStyle w:val="Heading3"/>
       </w:pPr>
-      <w:bookmarkStart w:id="26" w:name="_Toc244102473"/>
+      <w:bookmarkStart w:id="26" w:name="_Toc244113242"/>
       <w:r>
         <w:rPr>
           <w:b w:val="0"/>
@@ -13311,7 +13191,7 @@
       <w:pPr>
         <w:pStyle w:val="Heading3"/>
       </w:pPr>
-      <w:bookmarkStart w:id="27" w:name="_Toc244102474"/>
+      <w:bookmarkStart w:id="27" w:name="_Toc244113243"/>
       <w:r>
         <w:rPr>
           <w:b w:val="0"/>
@@ -13349,31 +13229,7 @@
         <w:pStyle w:val="CodeBlock"/>
       </w:pPr>
       <w:r>
-        <w:t xml:space="preserve">  Ki</w:t>
-      </w:r>
-      <w:r>
-        <w:t>ể</w:t>
-      </w:r>
-      <w:r>
-        <w:t>m ki</w:t>
-      </w:r>
-      <w:r>
-        <w:t>ể</w:t>
-      </w:r>
-      <w:r>
-        <w:t>u danh sách, ki</w:t>
-      </w:r>
-      <w:r>
-        <w:t>ể</w:t>
-      </w:r>
-      <w:r>
-        <w:t>u g</w:t>
-      </w:r>
-      <w:r>
-        <w:t>ố</w:t>
-      </w:r>
-      <w:r>
-        <w:t>c và 0 ≤ n ≤ 100.</w:t>
+        <w:t xml:space="preserve">  Kiểm kiểu danh sách, kiểu gốc và 0 ≤ n ≤ 100.</w:t>
       </w:r>
     </w:p>
     <w:p>
@@ -13381,37 +13237,7 @@
         <w:pStyle w:val="CodeBlock"/>
       </w:pPr>
       <w:r>
-        <w:t xml:space="preserve">  N</w:t>
-      </w:r>
-      <w:r>
-        <w:t>ế</w:t>
-      </w:r>
-      <w:r>
-        <w:t>u n = 0: yêu c</w:t>
-      </w:r>
-      <w:r>
-        <w:t>ầ</w:t>
-      </w:r>
-      <w:r>
-        <w:t>u goc = 0; tr</w:t>
-      </w:r>
-      <w:r>
-        <w:t>ả</w:t>
-      </w:r>
-      <w:r>
-        <w:t xml:space="preserve"> h</w:t>
-      </w:r>
-      <w:r>
-        <w:t>ợ</w:t>
-      </w:r>
-      <w:r>
-        <w:t>p l</w:t>
-      </w:r>
-      <w:r>
-        <w:t>ệ</w:t>
-      </w:r>
-      <w:r>
-        <w:t>.</w:t>
+        <w:t xml:space="preserve">  Nếu n = 0: yêu cầu goc = 0; trả hợp lệ.</w:t>
       </w:r>
     </w:p>
     <w:p>
@@ -13419,19 +13245,7 @@
         <w:pStyle w:val="CodeBlock"/>
       </w:pPr>
       <w:r>
-        <w:t xml:space="preserve">  Yêu c</w:t>
-      </w:r>
-      <w:r>
-        <w:t>ầ</w:t>
-      </w:r>
-      <w:r>
-        <w:t>u goc thu</w:t>
-      </w:r>
-      <w:r>
-        <w:t>ộ</w:t>
-      </w:r>
-      <w:r>
-        <w:t>c 1..n.</w:t>
+        <w:t xml:space="preserve">  Yêu cầu goc thuộc 1..n.</w:t>
       </w:r>
     </w:p>
     <w:p>
@@ -13439,19 +13253,7 @@
         <w:pStyle w:val="CodeBlock"/>
       </w:pPr>
       <w:r>
-        <w:t xml:space="preserve">  T</w:t>
-      </w:r>
-      <w:r>
-        <w:t>ạ</w:t>
-      </w:r>
-      <w:r>
-        <w:t>o các m</w:t>
-      </w:r>
-      <w:r>
-        <w:t>ả</w:t>
-      </w:r>
-      <w:r>
-        <w:t>ng co_id, bac_vao, con_trai, con_phai theo ID.</w:t>
+        <w:t xml:space="preserve">  Tạo các mảng co_id, bac_vao, con_trai, con_phai theo ID.</w:t>
       </w:r>
     </w:p>
     <w:p>
@@ -13459,37 +13261,7 @@
         <w:pStyle w:val="CodeBlock"/>
       </w:pPr>
       <w:r>
-        <w:t xml:space="preserve">  V</w:t>
-      </w:r>
-      <w:r>
-        <w:t>ớ</w:t>
-      </w:r>
-      <w:r>
-        <w:t>i m</w:t>
-      </w:r>
-      <w:r>
-        <w:t>ỗ</w:t>
-      </w:r>
-      <w:r>
-        <w:t>i b</w:t>
-      </w:r>
-      <w:r>
-        <w:t>ả</w:t>
-      </w:r>
-      <w:r>
-        <w:t>n ghi (id, giá_tr</w:t>
-      </w:r>
-      <w:r>
-        <w:t>ị</w:t>
-      </w:r>
-      <w:r>
-        <w:t>, trái, ph</w:t>
-      </w:r>
-      <w:r>
-        <w:t>ả</w:t>
-      </w:r>
-      <w:r>
-        <w:t>i):</w:t>
+        <w:t xml:space="preserve">  Với mỗi bản ghi (id, giá_trị, trái, phải):</w:t>
       </w:r>
     </w:p>
     <w:p>
@@ -13497,49 +13269,7 @@
         <w:pStyle w:val="CodeBlock"/>
       </w:pPr>
       <w:r>
-        <w:t xml:space="preserve">    Ki</w:t>
-      </w:r>
-      <w:r>
-        <w:t>ể</w:t>
-      </w:r>
-      <w:r>
-        <w:t>m đ</w:t>
-      </w:r>
-      <w:r>
-        <w:t>ủ</w:t>
-      </w:r>
-      <w:r>
-        <w:t xml:space="preserve"> 4 trư</w:t>
-      </w:r>
-      <w:r>
-        <w:t>ờ</w:t>
-      </w:r>
-      <w:r>
-        <w:t>ng, ID/con nguyên, mi</w:t>
-      </w:r>
-      <w:r>
-        <w:t>ề</w:t>
-      </w:r>
-      <w:r>
-        <w:t>n ch</w:t>
-      </w:r>
-      <w:r>
-        <w:t>ỉ</w:t>
-      </w:r>
-      <w:r>
-        <w:t xml:space="preserve"> s</w:t>
-      </w:r>
-      <w:r>
-        <w:t>ố</w:t>
-      </w:r>
-      <w:r>
-        <w:t xml:space="preserve"> và giá tr</w:t>
-      </w:r>
-      <w:r>
-        <w:t>ị</w:t>
-      </w:r>
-      <w:r>
-        <w:t>.</w:t>
+        <w:t xml:space="preserve">    Kiểm đủ 4 trường, ID/con nguyên, miền chỉ số và giá trị.</w:t>
       </w:r>
     </w:p>
     <w:p>
@@ -13547,37 +13277,7 @@
         <w:pStyle w:val="CodeBlock"/>
       </w:pPr>
       <w:r>
-        <w:t xml:space="preserve">    T</w:t>
-      </w:r>
-      <w:r>
-        <w:t>ừ</w:t>
-      </w:r>
-      <w:r>
-        <w:t xml:space="preserve"> ch</w:t>
-      </w:r>
-      <w:r>
-        <w:t>ố</w:t>
-      </w:r>
-      <w:r>
-        <w:t>i ID l</w:t>
-      </w:r>
-      <w:r>
-        <w:t>ặ</w:t>
-      </w:r>
-      <w:r>
-        <w:t>p, khuyên, hai con trùng ho</w:t>
-      </w:r>
-      <w:r>
-        <w:t>ặ</w:t>
-      </w:r>
-      <w:r>
-        <w:t>c con có hơn m</w:t>
-      </w:r>
-      <w:r>
-        <w:t>ộ</w:t>
-      </w:r>
-      <w:r>
-        <w:t>t cha.</w:t>
+        <w:t xml:space="preserve">    Từ chối ID lặp, khuyên, hai con trùng hoặc con có hơn một cha.</w:t>
       </w:r>
     </w:p>
     <w:p>
@@ -13585,31 +13285,7 @@
         <w:pStyle w:val="CodeBlock"/>
       </w:pPr>
       <w:r>
-        <w:t xml:space="preserve">    Lưu hai con theo ID và tăng b</w:t>
-      </w:r>
-      <w:r>
-        <w:t>ậ</w:t>
-      </w:r>
-      <w:r>
-        <w:t>c vào c</w:t>
-      </w:r>
-      <w:r>
-        <w:t>ủ</w:t>
-      </w:r>
-      <w:r>
-        <w:t>a con t</w:t>
-      </w:r>
-      <w:r>
-        <w:t>ồ</w:t>
-      </w:r>
-      <w:r>
-        <w:t>n t</w:t>
-      </w:r>
-      <w:r>
-        <w:t>ạ</w:t>
-      </w:r>
-      <w:r>
-        <w:t>i.</w:t>
+        <w:t xml:space="preserve">    Lưu hai con theo ID và tăng bậc vào của con tồn tại.</w:t>
       </w:r>
     </w:p>
     <w:p>
@@ -13618,43 +13294,7 @@
       </w:pPr>
       <w:r>
         <w:lastRenderedPageBreak/>
-        <w:t xml:space="preserve">  Yêu c</w:t>
-      </w:r>
-      <w:r>
-        <w:t>ầ</w:t>
-      </w:r>
-      <w:r>
-        <w:t>u đ</w:t>
-      </w:r>
-      <w:r>
-        <w:t>ủ</w:t>
-      </w:r>
-      <w:r>
-        <w:t xml:space="preserve"> các ID 1..n và b</w:t>
-      </w:r>
-      <w:r>
-        <w:t>ậ</w:t>
-      </w:r>
-      <w:r>
-        <w:t>c vào c</w:t>
-      </w:r>
-      <w:r>
-        <w:t>ủ</w:t>
-      </w:r>
-      <w:r>
-        <w:t>a g</w:t>
-      </w:r>
-      <w:r>
-        <w:t>ố</w:t>
-      </w:r>
-      <w:r>
-        <w:t>c b</w:t>
-      </w:r>
-      <w:r>
-        <w:t>ằ</w:t>
-      </w:r>
-      <w:r>
-        <w:t>ng 0.</w:t>
+        <w:t xml:space="preserve">  Yêu cầu đủ các ID 1..n và bậc vào của gốc bằng 0.</w:t>
       </w:r>
     </w:p>
     <w:p>
@@ -13662,43 +13302,7 @@
         <w:pStyle w:val="CodeBlock"/>
       </w:pPr>
       <w:r>
-        <w:t xml:space="preserve">  Duy</w:t>
-      </w:r>
-      <w:r>
-        <w:t>ệ</w:t>
-      </w:r>
-      <w:r>
-        <w:t>t t</w:t>
-      </w:r>
-      <w:r>
-        <w:t>ừ</w:t>
-      </w:r>
-      <w:r>
-        <w:t xml:space="preserve"> g</w:t>
-      </w:r>
-      <w:r>
-        <w:t>ố</w:t>
-      </w:r>
-      <w:r>
-        <w:t>c b</w:t>
-      </w:r>
-      <w:r>
-        <w:t>ằ</w:t>
-      </w:r>
-      <w:r>
-        <w:t>ng hàng đ</w:t>
-      </w:r>
-      <w:r>
-        <w:t>ợ</w:t>
-      </w:r>
-      <w:r>
-        <w:t>i, đánh d</w:t>
-      </w:r>
-      <w:r>
-        <w:t>ấ</w:t>
-      </w:r>
-      <w:r>
-        <w:t>u ngay lúc thêm.</w:t>
+        <w:t xml:space="preserve">  Duyệt từ gốc bằng hàng đợi, đánh dấu ngay lúc thêm.</w:t>
       </w:r>
     </w:p>
     <w:p>
@@ -13706,55 +13310,7 @@
         <w:pStyle w:val="CodeBlock"/>
       </w:pPr>
       <w:r>
-        <w:t xml:space="preserve">  T</w:t>
-      </w:r>
-      <w:r>
-        <w:t>ừ</w:t>
-      </w:r>
-      <w:r>
-        <w:t xml:space="preserve"> ch</w:t>
-      </w:r>
-      <w:r>
-        <w:t>ố</w:t>
-      </w:r>
-      <w:r>
-        <w:t>i n</w:t>
-      </w:r>
-      <w:r>
-        <w:t>ế</w:t>
-      </w:r>
-      <w:r>
-        <w:t>u g</w:t>
-      </w:r>
-      <w:r>
-        <w:t>ặ</w:t>
-      </w:r>
-      <w:r>
-        <w:t>p nút đã đánh d</w:t>
-      </w:r>
-      <w:r>
-        <w:t>ấ</w:t>
-      </w:r>
-      <w:r>
-        <w:t>u ho</w:t>
-      </w:r>
-      <w:r>
-        <w:t>ặ</w:t>
-      </w:r>
-      <w:r>
-        <w:t>c còn ID chưa t</w:t>
-      </w:r>
-      <w:r>
-        <w:t>ớ</w:t>
-      </w:r>
-      <w:r>
-        <w:t>i đư</w:t>
-      </w:r>
-      <w:r>
-        <w:t>ợ</w:t>
-      </w:r>
-      <w:r>
-        <w:t>c.</w:t>
+        <w:t xml:space="preserve">  Từ chối nếu gặp nút đã đánh dấu hoặc còn ID chưa tới được.</w:t>
       </w:r>
     </w:p>
     <w:p>
@@ -13762,25 +13318,7 @@
         <w:pStyle w:val="CodeBlock"/>
       </w:pPr>
       <w:r>
-        <w:t xml:space="preserve">  Tr</w:t>
-      </w:r>
-      <w:r>
-        <w:t>ả</w:t>
-      </w:r>
-      <w:r>
-        <w:t xml:space="preserve"> h</w:t>
-      </w:r>
-      <w:r>
-        <w:t>ợ</w:t>
-      </w:r>
-      <w:r>
-        <w:t>p l</w:t>
-      </w:r>
-      <w:r>
-        <w:t>ệ</w:t>
-      </w:r>
-      <w:r>
-        <w:t>.</w:t>
+        <w:t xml:space="preserve">  Trả hợp lệ.</w:t>
       </w:r>
     </w:p>
     <w:p>
@@ -13793,7 +13331,7 @@
       <w:pPr>
         <w:pStyle w:val="Heading2"/>
       </w:pPr>
-      <w:bookmarkStart w:id="28" w:name="_Toc244102475"/>
+      <w:bookmarkStart w:id="28" w:name="_Toc244113244"/>
       <w:r>
         <w:rPr>
           <w:b w:val="0"/>
@@ -13806,7 +13344,7 @@
       <w:pPr>
         <w:pStyle w:val="TableCaption"/>
       </w:pPr>
-      <w:bookmarkStart w:id="29" w:name="_Toc244102528"/>
+      <w:bookmarkStart w:id="29" w:name="_Toc244113297"/>
       <w:r>
         <w:rPr>
           <w:b w:val="0"/>
@@ -14443,7 +13981,7 @@
       <w:pPr>
         <w:pStyle w:val="Heading2"/>
       </w:pPr>
-      <w:bookmarkStart w:id="30" w:name="_Toc244102476"/>
+      <w:bookmarkStart w:id="30" w:name="_Toc244113245"/>
       <w:r>
         <w:rPr>
           <w:b w:val="0"/>
@@ -14456,7 +13994,7 @@
       <w:pPr>
         <w:pStyle w:val="Heading3"/>
       </w:pPr>
-      <w:bookmarkStart w:id="31" w:name="_Toc244102477"/>
+      <w:bookmarkStart w:id="31" w:name="_Toc244113246"/>
       <w:r>
         <w:rPr>
           <w:b w:val="0"/>
@@ -14486,43 +14024,7 @@
         <w:pStyle w:val="CodeBlock"/>
       </w:pPr>
       <w:r>
-        <w:t xml:space="preserve">  N</w:t>
-      </w:r>
-      <w:r>
-        <w:t>ế</w:t>
-      </w:r>
-      <w:r>
-        <w:t>u cây r</w:t>
-      </w:r>
-      <w:r>
-        <w:t>ỗ</w:t>
-      </w:r>
-      <w:r>
-        <w:t>ng: tr</w:t>
-      </w:r>
-      <w:r>
-        <w:t>ả</w:t>
-      </w:r>
-      <w:r>
-        <w:t xml:space="preserve"> các dãy r</w:t>
-      </w:r>
-      <w:r>
-        <w:t>ỗ</w:t>
-      </w:r>
-      <w:r>
-        <w:t>ng và b</w:t>
-      </w:r>
-      <w:r>
-        <w:t>ộ</w:t>
-      </w:r>
-      <w:r>
-        <w:t xml:space="preserve"> đ</w:t>
-      </w:r>
-      <w:r>
-        <w:t>ế</w:t>
-      </w:r>
-      <w:r>
-        <w:t>m 0.</w:t>
+        <w:t xml:space="preserve">  Nếu cây rỗng: trả các dãy rỗng và bộ đếm 0.</w:t>
       </w:r>
     </w:p>
     <w:p>
@@ -14530,19 +14032,7 @@
         <w:pStyle w:val="CodeBlock"/>
       </w:pPr>
       <w:r>
-        <w:t xml:space="preserve">  D</w:t>
-      </w:r>
-      <w:r>
-        <w:t>ự</w:t>
-      </w:r>
-      <w:r>
-        <w:t>ng cay[id]; t</w:t>
-      </w:r>
-      <w:r>
-        <w:t>ạ</w:t>
-      </w:r>
-      <w:r>
-        <w:t>o hang_id[1..n], hang_muc[1..n].</w:t>
+        <w:t xml:space="preserve">  Dựng cay[id]; tạo hang_id[1..n], hang_muc[1..n].</w:t>
       </w:r>
     </w:p>
     <w:p>
@@ -14558,31 +14048,7 @@
         <w:pStyle w:val="CodeBlock"/>
       </w:pPr>
       <w:r>
-        <w:t xml:space="preserve">  Kh</w:t>
-      </w:r>
-      <w:r>
-        <w:t>ở</w:t>
-      </w:r>
-      <w:r>
-        <w:t>i t</w:t>
-      </w:r>
-      <w:r>
-        <w:t>ạ</w:t>
-      </w:r>
-      <w:r>
-        <w:t>o các nhóm, dãy giá tr</w:t>
-      </w:r>
-      <w:r>
-        <w:t>ị</w:t>
-      </w:r>
-      <w:r>
-        <w:t xml:space="preserve"> và dãy ID r</w:t>
-      </w:r>
-      <w:r>
-        <w:t>ỗ</w:t>
-      </w:r>
-      <w:r>
-        <w:t>ng.</w:t>
+        <w:t xml:space="preserve">  Khởi tạo các nhóm, dãy giá trị và dãy ID rỗng.</w:t>
       </w:r>
     </w:p>
     <w:p>
@@ -14622,19 +14088,7 @@
         <w:pStyle w:val="CodeBlock"/>
       </w:pPr>
       <w:r>
-        <w:t xml:space="preserve">    Ghi giá tr</w:t>
-      </w:r>
-      <w:r>
-        <w:t>ị</w:t>
-      </w:r>
-      <w:r>
-        <w:t xml:space="preserve"> u và ID u vào hai dãy duy</w:t>
-      </w:r>
-      <w:r>
-        <w:t>ệ</w:t>
-      </w:r>
-      <w:r>
-        <w:t>t.</w:t>
+        <w:t xml:space="preserve">    Ghi giá trị u và ID u vào hai dãy duyệt.</w:t>
       </w:r>
     </w:p>
     <w:p>
@@ -14642,31 +14096,7 @@
         <w:pStyle w:val="CodeBlock"/>
       </w:pPr>
       <w:r>
-        <w:t xml:space="preserve">    T</w:t>
-      </w:r>
-      <w:r>
-        <w:t>ạ</w:t>
-      </w:r>
-      <w:r>
-        <w:t>o nhóm m n</w:t>
-      </w:r>
-      <w:r>
-        <w:t>ế</w:t>
-      </w:r>
-      <w:r>
-        <w:t>u chưa có, r</w:t>
-      </w:r>
-      <w:r>
-        <w:t>ồ</w:t>
-      </w:r>
-      <w:r>
-        <w:t>i thêm giá tr</w:t>
-      </w:r>
-      <w:r>
-        <w:t>ị</w:t>
-      </w:r>
-      <w:r>
-        <w:t xml:space="preserve"> u vào nhóm m.</w:t>
+        <w:t xml:space="preserve">    Tạo nhóm m nếu chưa có, rồi thêm giá trị u vào nhóm m.</w:t>
       </w:r>
     </w:p>
     <w:p>
@@ -14674,43 +14104,7 @@
         <w:pStyle w:val="CodeBlock"/>
       </w:pPr>
       <w:r>
-        <w:t xml:space="preserve">    V</w:t>
-      </w:r>
-      <w:r>
-        <w:t>ớ</w:t>
-      </w:r>
-      <w:r>
-        <w:t>i v l</w:t>
-      </w:r>
-      <w:r>
-        <w:t>ầ</w:t>
-      </w:r>
-      <w:r>
-        <w:t>n lư</w:t>
-      </w:r>
-      <w:r>
-        <w:t>ợ</w:t>
-      </w:r>
-      <w:r>
-        <w:t>t là con trái r</w:t>
-      </w:r>
-      <w:r>
-        <w:t>ồ</w:t>
-      </w:r>
-      <w:r>
-        <w:t>i con ph</w:t>
-      </w:r>
-      <w:r>
-        <w:t>ả</w:t>
-      </w:r>
-      <w:r>
-        <w:t>i c</w:t>
-      </w:r>
-      <w:r>
-        <w:t>ủ</w:t>
-      </w:r>
-      <w:r>
-        <w:t>a u:</w:t>
+        <w:t xml:space="preserve">    Với v lần lượt là con trái rồi con phải của u:</w:t>
       </w:r>
     </w:p>
     <w:p>
@@ -14718,13 +14112,7 @@
         <w:pStyle w:val="CodeBlock"/>
       </w:pPr>
       <w:r>
-        <w:t xml:space="preserve">      N</w:t>
-      </w:r>
-      <w:r>
-        <w:t>ế</w:t>
-      </w:r>
-      <w:r>
-        <w:t>u v ≠ 0: cuoi ← cuoi + 1;</w:t>
+        <w:t xml:space="preserve">      Nếu v ≠ 0: cuoi ← cuoi + 1;</w:t>
       </w:r>
     </w:p>
     <w:p>
@@ -14740,25 +14128,7 @@
         <w:pStyle w:val="CodeBlock"/>
       </w:pPr>
       <w:r>
-        <w:t xml:space="preserve">  Tr</w:t>
-      </w:r>
-      <w:r>
-        <w:t>ả</w:t>
-      </w:r>
-      <w:r>
-        <w:t xml:space="preserve"> các nhóm, các dãy và b</w:t>
-      </w:r>
-      <w:r>
-        <w:t>ộ</w:t>
-      </w:r>
-      <w:r>
-        <w:t xml:space="preserve"> đ</w:t>
-      </w:r>
-      <w:r>
-        <w:t>ế</w:t>
-      </w:r>
-      <w:r>
-        <w:t>m.</w:t>
+        <w:t xml:space="preserve">  Trả các nhóm, các dãy và bộ đếm.</w:t>
       </w:r>
     </w:p>
     <w:p>
@@ -14781,31 +14151,7 @@
         <w:pStyle w:val="CodeBlock"/>
       </w:pPr>
       <w:r>
-        <w:t xml:space="preserve">  N</w:t>
-      </w:r>
-      <w:r>
-        <w:t>ế</w:t>
-      </w:r>
-      <w:r>
-        <w:t>u không có nhóm: tr</w:t>
-      </w:r>
-      <w:r>
-        <w:t>ả</w:t>
-      </w:r>
-      <w:r>
-        <w:t xml:space="preserve"> (0, không t</w:t>
-      </w:r>
-      <w:r>
-        <w:t>ồ</w:t>
-      </w:r>
-      <w:r>
-        <w:t>n t</w:t>
-      </w:r>
-      <w:r>
-        <w:t>ạ</w:t>
-      </w:r>
-      <w:r>
-        <w:t>i).</w:t>
+        <w:t xml:space="preserve">  Nếu không có nhóm: trả (0, không tồn tại).</w:t>
       </w:r>
     </w:p>
     <w:p>
@@ -14813,37 +14159,7 @@
         <w:pStyle w:val="CodeBlock"/>
       </w:pPr>
       <w:r>
-        <w:t xml:space="preserve">  w ← đ</w:t>
-      </w:r>
-      <w:r>
-        <w:t>ộ</w:t>
-      </w:r>
-      <w:r>
-        <w:t xml:space="preserve"> dài t</w:t>
-      </w:r>
-      <w:r>
-        <w:t>ừ</w:t>
-      </w:r>
-      <w:r>
-        <w:t>ng nhóm theo th</w:t>
-      </w:r>
-      <w:r>
-        <w:t>ứ</w:t>
-      </w:r>
-      <w:r>
-        <w:t xml:space="preserve"> t</w:t>
-      </w:r>
-      <w:r>
-        <w:t>ự</w:t>
-      </w:r>
-      <w:r>
-        <w:t xml:space="preserve"> m</w:t>
-      </w:r>
-      <w:r>
-        <w:t>ứ</w:t>
-      </w:r>
-      <w:r>
-        <w:t>c.</w:t>
+        <w:t xml:space="preserve">  w ← độ dài từng nhóm theo thứ tự mức.</w:t>
       </w:r>
     </w:p>
     <w:p>
@@ -14851,31 +14167,7 @@
         <w:pStyle w:val="CodeBlock"/>
       </w:pPr>
       <w:r>
-        <w:t xml:space="preserve">  rong_nhat ← giá tr</w:t>
-      </w:r>
-      <w:r>
-        <w:t>ị</w:t>
-      </w:r>
-      <w:r>
-        <w:t xml:space="preserve"> l</w:t>
-      </w:r>
-      <w:r>
-        <w:t>ớ</w:t>
-      </w:r>
-      <w:r>
-        <w:t>n nh</w:t>
-      </w:r>
-      <w:r>
-        <w:t>ấ</w:t>
-      </w:r>
-      <w:r>
-        <w:t>t c</w:t>
-      </w:r>
-      <w:r>
-        <w:t>ủ</w:t>
-      </w:r>
-      <w:r>
-        <w:t>a w.</w:t>
+        <w:t xml:space="preserve">  rong_nhat ← giá trị lớn nhất của w.</w:t>
       </w:r>
     </w:p>
     <w:p>
@@ -14883,31 +14175,7 @@
         <w:pStyle w:val="CodeBlock"/>
       </w:pPr>
       <w:r>
-        <w:t xml:space="preserve">  i ← ch</w:t>
-      </w:r>
-      <w:r>
-        <w:t>ỉ</w:t>
-      </w:r>
-      <w:r>
-        <w:t xml:space="preserve"> s</w:t>
-      </w:r>
-      <w:r>
-        <w:t>ố</w:t>
-      </w:r>
-      <w:r>
-        <w:t xml:space="preserve"> đ</w:t>
-      </w:r>
-      <w:r>
-        <w:t>ầ</w:t>
-      </w:r>
-      <w:r>
-        <w:t>u tiên th</w:t>
-      </w:r>
-      <w:r>
-        <w:t>ỏ</w:t>
-      </w:r>
-      <w:r>
-        <w:t>a w[i] = rong_nhat.</w:t>
+        <w:t xml:space="preserve">  i ← chỉ số đầu tiên thỏa w[i] = rong_nhat.</w:t>
       </w:r>
     </w:p>
     <w:p>
@@ -14915,13 +14183,7 @@
         <w:pStyle w:val="CodeBlock"/>
       </w:pPr>
       <w:r>
-        <w:t xml:space="preserve">  Tr</w:t>
-      </w:r>
-      <w:r>
-        <w:t>ả</w:t>
-      </w:r>
-      <w:r>
-        <w:t xml:space="preserve"> (rong_nhat, i − 1).</w:t>
+        <w:t xml:space="preserve">  Trả (rong_nhat, i − 1).</w:t>
       </w:r>
     </w:p>
     <w:p>
@@ -14934,7 +14196,7 @@
       <w:pPr>
         <w:pStyle w:val="Heading3"/>
       </w:pPr>
-      <w:bookmarkStart w:id="32" w:name="_Toc244102478"/>
+      <w:bookmarkStart w:id="32" w:name="_Toc244113247"/>
       <w:r>
         <w:rPr>
           <w:b w:val="0"/>
@@ -15225,7 +14487,7 @@
       <w:pPr>
         <w:pStyle w:val="Heading3"/>
       </w:pPr>
-      <w:bookmarkStart w:id="33" w:name="_Toc244102479"/>
+      <w:bookmarkStart w:id="33" w:name="_Toc244113248"/>
       <w:r>
         <w:rPr>
           <w:b w:val="0"/>
@@ -15239,7 +14501,7 @@
       <w:pPr>
         <w:pStyle w:val="TableCaption"/>
       </w:pPr>
-      <w:bookmarkStart w:id="34" w:name="_Toc244102529"/>
+      <w:bookmarkStart w:id="34" w:name="_Toc244113298"/>
       <w:r>
         <w:rPr>
           <w:b w:val="0"/>
@@ -15683,7 +14945,7 @@
       <w:pPr>
         <w:pStyle w:val="Heading2"/>
       </w:pPr>
-      <w:bookmarkStart w:id="35" w:name="_Toc244102480"/>
+      <w:bookmarkStart w:id="35" w:name="_Toc244113249"/>
       <w:r>
         <w:rPr>
           <w:b w:val="0"/>
@@ -15704,7 +14966,7 @@
       <w:pPr>
         <w:pStyle w:val="TableCaption"/>
       </w:pPr>
-      <w:bookmarkStart w:id="36" w:name="_Toc244102530"/>
+      <w:bookmarkStart w:id="36" w:name="_Toc244113299"/>
       <w:r>
         <w:rPr>
           <w:b w:val="0"/>
@@ -16373,7 +15635,7 @@
       <w:pPr>
         <w:pStyle w:val="TableCaption"/>
       </w:pPr>
-      <w:bookmarkStart w:id="37" w:name="_Toc244102531"/>
+      <w:bookmarkStart w:id="37" w:name="_Toc244113300"/>
       <w:r>
         <w:rPr>
           <w:b w:val="0"/>
@@ -16940,7 +16202,7 @@
       <w:pPr>
         <w:pStyle w:val="Heading2"/>
       </w:pPr>
-      <w:bookmarkStart w:id="38" w:name="_Toc244102481"/>
+      <w:bookmarkStart w:id="38" w:name="_Toc244113250"/>
       <w:r>
         <w:rPr>
           <w:b w:val="0"/>
@@ -16953,7 +16215,7 @@
       <w:pPr>
         <w:pStyle w:val="Heading3"/>
       </w:pPr>
-      <w:bookmarkStart w:id="39" w:name="_Toc244102482"/>
+      <w:bookmarkStart w:id="39" w:name="_Toc244113251"/>
       <w:r>
         <w:rPr>
           <w:b w:val="0"/>
@@ -16991,7 +16253,7 @@
       <w:pPr>
         <w:pStyle w:val="Heading3"/>
       </w:pPr>
-      <w:bookmarkStart w:id="40" w:name="_Toc244102483"/>
+      <w:bookmarkStart w:id="40" w:name="_Toc244113252"/>
       <w:r>
         <w:rPr>
           <w:b w:val="0"/>
@@ -17036,7 +16298,7 @@
       <w:pPr>
         <w:pStyle w:val="Heading2"/>
       </w:pPr>
-      <w:bookmarkStart w:id="41" w:name="_Toc244102484"/>
+      <w:bookmarkStart w:id="41" w:name="_Toc244113253"/>
       <w:r>
         <w:rPr>
           <w:b w:val="0"/>
@@ -17057,7 +16319,7 @@
       <w:pPr>
         <w:pStyle w:val="TableCaption"/>
       </w:pPr>
-      <w:bookmarkStart w:id="42" w:name="_Toc244102532"/>
+      <w:bookmarkStart w:id="42" w:name="_Toc244113301"/>
       <w:r>
         <w:rPr>
           <w:b w:val="0"/>
@@ -17698,7 +16960,7 @@
       <w:pPr>
         <w:pStyle w:val="Heading1"/>
       </w:pPr>
-      <w:bookmarkStart w:id="43" w:name="_Toc244102485"/>
+      <w:bookmarkStart w:id="43" w:name="_Toc244113254"/>
       <w:r>
         <w:rPr>
           <w:b w:val="0"/>
@@ -17712,7 +16974,7 @@
       <w:pPr>
         <w:pStyle w:val="Heading2"/>
       </w:pPr>
-      <w:bookmarkStart w:id="44" w:name="_Toc244102486"/>
+      <w:bookmarkStart w:id="44" w:name="_Toc244113255"/>
       <w:r>
         <w:rPr>
           <w:b w:val="0"/>
@@ -17725,7 +16987,7 @@
       <w:pPr>
         <w:pStyle w:val="Heading3"/>
       </w:pPr>
-      <w:bookmarkStart w:id="45" w:name="_Toc244102487"/>
+      <w:bookmarkStart w:id="45" w:name="_Toc244113256"/>
       <w:r>
         <w:rPr>
           <w:b w:val="0"/>
@@ -17738,7 +17000,7 @@
       <w:pPr>
         <w:pStyle w:val="TableCaption"/>
       </w:pPr>
-      <w:bookmarkStart w:id="46" w:name="_Toc244102533"/>
+      <w:bookmarkStart w:id="46" w:name="_Toc244113302"/>
       <w:r>
         <w:rPr>
           <w:b w:val="0"/>
@@ -18182,7 +17444,7 @@
       <w:pPr>
         <w:pStyle w:val="Heading3"/>
       </w:pPr>
-      <w:bookmarkStart w:id="47" w:name="_Toc244102488"/>
+      <w:bookmarkStart w:id="47" w:name="_Toc244113257"/>
       <w:r>
         <w:rPr>
           <w:b w:val="0"/>
@@ -18215,7 +17477,7 @@
       <w:pPr>
         <w:pStyle w:val="Heading2"/>
       </w:pPr>
-      <w:bookmarkStart w:id="48" w:name="_Toc244102489"/>
+      <w:bookmarkStart w:id="48" w:name="_Toc244113258"/>
       <w:r>
         <w:rPr>
           <w:b w:val="0"/>
@@ -18228,7 +17490,7 @@
       <w:pPr>
         <w:pStyle w:val="TableCaption"/>
       </w:pPr>
-      <w:bookmarkStart w:id="49" w:name="_Toc244102534"/>
+      <w:bookmarkStart w:id="49" w:name="_Toc244113303"/>
       <w:r>
         <w:rPr>
           <w:b w:val="0"/>
@@ -18659,7 +17921,7 @@
       <w:pPr>
         <w:pStyle w:val="TableCaption"/>
       </w:pPr>
-      <w:bookmarkStart w:id="50" w:name="_Toc244102535"/>
+      <w:bookmarkStart w:id="50" w:name="_Toc244113304"/>
       <w:r>
         <w:rPr>
           <w:b w:val="0"/>
@@ -18792,8 +18054,6 @@
             </w:r>
             <w:r>
               <w:br/>
-            </w:r>
-            <w:r>
               <w:t>giai_bai / duyet_muc / do_rong / muc_rong_nhat</w:t>
             </w:r>
           </w:p>
@@ -18865,8 +18125,6 @@
             </w:r>
             <w:r>
               <w:br/>
-            </w:r>
-            <w:r>
               <w:t>giai_bai / duyet_muc / do_rong / muc_rong_nhat</w:t>
             </w:r>
           </w:p>
@@ -19704,7 +18962,7 @@
       <w:pPr>
         <w:pStyle w:val="TableCaption"/>
       </w:pPr>
-      <w:bookmarkStart w:id="51" w:name="_Toc244102536"/>
+      <w:bookmarkStart w:id="51" w:name="_Toc244113305"/>
       <w:r>
         <w:rPr>
           <w:b w:val="0"/>
@@ -20697,7 +19955,7 @@
       <w:pPr>
         <w:pStyle w:val="Heading2"/>
       </w:pPr>
-      <w:bookmarkStart w:id="52" w:name="_Toc244102490"/>
+      <w:bookmarkStart w:id="52" w:name="_Toc244113259"/>
       <w:r>
         <w:rPr>
           <w:b w:val="0"/>
@@ -20710,7 +19968,7 @@
       <w:pPr>
         <w:pStyle w:val="Heading3"/>
       </w:pPr>
-      <w:bookmarkStart w:id="53" w:name="_Toc244102491"/>
+      <w:bookmarkStart w:id="53" w:name="_Toc244113260"/>
       <w:r>
         <w:rPr>
           <w:b w:val="0"/>
@@ -20743,7 +20001,7 @@
       <w:pPr>
         <w:pStyle w:val="Heading3"/>
       </w:pPr>
-      <w:bookmarkStart w:id="54" w:name="_Toc244102492"/>
+      <w:bookmarkStart w:id="54" w:name="_Toc244113261"/>
       <w:r>
         <w:rPr>
           <w:b w:val="0"/>
@@ -20772,7 +20030,7 @@
       <w:pPr>
         <w:pStyle w:val="Heading2"/>
       </w:pPr>
-      <w:bookmarkStart w:id="55" w:name="_Toc244102493"/>
+      <w:bookmarkStart w:id="55" w:name="_Toc244113262"/>
       <w:r>
         <w:rPr>
           <w:b w:val="0"/>
@@ -20785,7 +20043,7 @@
       <w:pPr>
         <w:pStyle w:val="Heading3"/>
       </w:pPr>
-      <w:bookmarkStart w:id="56" w:name="_Toc244102494"/>
+      <w:bookmarkStart w:id="56" w:name="_Toc244113263"/>
       <w:r>
         <w:rPr>
           <w:b w:val="0"/>
@@ -20806,7 +20064,7 @@
       <w:pPr>
         <w:pStyle w:val="Heading3"/>
       </w:pPr>
-      <w:bookmarkStart w:id="57" w:name="_Toc244102495"/>
+      <w:bookmarkStart w:id="57" w:name="_Toc244113264"/>
       <w:r>
         <w:rPr>
           <w:b w:val="0"/>
@@ -20827,7 +20085,7 @@
       <w:pPr>
         <w:pStyle w:val="Heading2"/>
       </w:pPr>
-      <w:bookmarkStart w:id="58" w:name="_Toc244102496"/>
+      <w:bookmarkStart w:id="58" w:name="_Toc244113265"/>
       <w:r>
         <w:rPr>
           <w:b w:val="0"/>
@@ -20840,7 +20098,7 @@
       <w:pPr>
         <w:pStyle w:val="Heading3"/>
       </w:pPr>
-      <w:bookmarkStart w:id="59" w:name="_Toc244102497"/>
+      <w:bookmarkStart w:id="59" w:name="_Toc244113266"/>
       <w:r>
         <w:rPr>
           <w:b w:val="0"/>
@@ -20861,7 +20119,7 @@
       <w:pPr>
         <w:pStyle w:val="Heading3"/>
       </w:pPr>
-      <w:bookmarkStart w:id="60" w:name="_Toc244102498"/>
+      <w:bookmarkStart w:id="60" w:name="_Toc244113267"/>
       <w:r>
         <w:rPr>
           <w:b w:val="0"/>
@@ -20883,7 +20141,7 @@
       <w:pPr>
         <w:pStyle w:val="Heading3"/>
       </w:pPr>
-      <w:bookmarkStart w:id="61" w:name="_Toc244102499"/>
+      <w:bookmarkStart w:id="61" w:name="_Toc244113268"/>
       <w:r>
         <w:rPr>
           <w:b w:val="0"/>
@@ -20904,7 +20162,7 @@
       <w:pPr>
         <w:pStyle w:val="Heading2"/>
       </w:pPr>
-      <w:bookmarkStart w:id="62" w:name="_Toc244102500"/>
+      <w:bookmarkStart w:id="62" w:name="_Toc244113269"/>
       <w:r>
         <w:rPr>
           <w:b w:val="0"/>
@@ -20933,7 +20191,7 @@
       <w:pPr>
         <w:pStyle w:val="Heading2"/>
       </w:pPr>
-      <w:bookmarkStart w:id="63" w:name="_Toc244102501"/>
+      <w:bookmarkStart w:id="63" w:name="_Toc244113270"/>
       <w:r>
         <w:rPr>
           <w:b w:val="0"/>
@@ -20946,7 +20204,7 @@
       <w:pPr>
         <w:pStyle w:val="TableCaption"/>
       </w:pPr>
-      <w:bookmarkStart w:id="64" w:name="_Toc244102537"/>
+      <w:bookmarkStart w:id="64" w:name="_Toc244113306"/>
       <w:r>
         <w:rPr>
           <w:b w:val="0"/>
@@ -21394,7 +20652,7 @@
       <w:pPr>
         <w:pStyle w:val="Heading2"/>
       </w:pPr>
-      <w:bookmarkStart w:id="65" w:name="_Toc244102502"/>
+      <w:bookmarkStart w:id="65" w:name="_Toc244113271"/>
       <w:r>
         <w:rPr>
           <w:b w:val="0"/>
@@ -21407,7 +20665,7 @@
       <w:pPr>
         <w:pStyle w:val="Heading3"/>
       </w:pPr>
-      <w:bookmarkStart w:id="66" w:name="_Toc244102503"/>
+      <w:bookmarkStart w:id="66" w:name="_Toc244113272"/>
       <w:r>
         <w:rPr>
           <w:b w:val="0"/>
@@ -21450,7 +20708,7 @@
       <w:pPr>
         <w:pStyle w:val="Heading3"/>
       </w:pPr>
-      <w:bookmarkStart w:id="67" w:name="_Toc244102504"/>
+      <w:bookmarkStart w:id="67" w:name="_Toc244113273"/>
       <w:r>
         <w:rPr>
           <w:b w:val="0"/>
@@ -21463,7 +20721,7 @@
       <w:pPr>
         <w:pStyle w:val="TableCaption"/>
       </w:pPr>
-      <w:bookmarkStart w:id="68" w:name="_Toc244102538"/>
+      <w:bookmarkStart w:id="68" w:name="_Toc244113307"/>
       <w:r>
         <w:rPr>
           <w:b w:val="0"/>
@@ -22404,7 +21662,7 @@
       <w:pPr>
         <w:pStyle w:val="Heading2"/>
       </w:pPr>
-      <w:bookmarkStart w:id="69" w:name="_Toc244102505"/>
+      <w:bookmarkStart w:id="69" w:name="_Toc244113274"/>
       <w:r>
         <w:rPr>
           <w:b w:val="0"/>
@@ -22417,7 +21675,7 @@
       <w:pPr>
         <w:pStyle w:val="Heading3"/>
       </w:pPr>
-      <w:bookmarkStart w:id="70" w:name="_Toc244102506"/>
+      <w:bookmarkStart w:id="70" w:name="_Toc244113275"/>
       <w:r>
         <w:rPr>
           <w:b w:val="0"/>
@@ -22438,7 +21696,7 @@
       <w:pPr>
         <w:pStyle w:val="TableCaption"/>
       </w:pPr>
-      <w:bookmarkStart w:id="71" w:name="_Toc244102539"/>
+      <w:bookmarkStart w:id="71" w:name="_Toc244113308"/>
       <w:r>
         <w:rPr>
           <w:b w:val="0"/>
@@ -22887,7 +22145,7 @@
       <w:pPr>
         <w:pStyle w:val="Heading3"/>
       </w:pPr>
-      <w:bookmarkStart w:id="72" w:name="_Toc244102507"/>
+      <w:bookmarkStart w:id="72" w:name="_Toc244113276"/>
       <w:r>
         <w:rPr>
           <w:b w:val="0"/>
@@ -22986,7 +22244,7 @@
       <w:pPr>
         <w:pStyle w:val="Heading3"/>
       </w:pPr>
-      <w:bookmarkStart w:id="73" w:name="_Toc244102508"/>
+      <w:bookmarkStart w:id="73" w:name="_Toc244113277"/>
       <w:r>
         <w:rPr>
           <w:b w:val="0"/>
@@ -23008,7 +22266,7 @@
       <w:pPr>
         <w:pStyle w:val="Heading2"/>
       </w:pPr>
-      <w:bookmarkStart w:id="74" w:name="_Toc244102509"/>
+      <w:bookmarkStart w:id="74" w:name="_Toc244113278"/>
       <w:r>
         <w:rPr>
           <w:b w:val="0"/>
@@ -23105,7 +22363,7 @@
         <w:keepNext/>
         <w:spacing w:before="0" w:after="80"/>
       </w:pPr>
-      <w:bookmarkStart w:id="75" w:name="_Toc244102546"/>
+      <w:bookmarkStart w:id="75" w:name="_Toc244113315"/>
       <w:r>
         <w:rPr>
           <w:b w:val="0"/>
@@ -23196,7 +22454,7 @@
         <w:keepNext/>
         <w:spacing w:before="0" w:after="80"/>
       </w:pPr>
-      <w:bookmarkStart w:id="76" w:name="_Toc244102547"/>
+      <w:bookmarkStart w:id="76" w:name="_Toc244113316"/>
       <w:r>
         <w:rPr>
           <w:b w:val="0"/>
@@ -23287,7 +22545,7 @@
         <w:keepNext/>
         <w:spacing w:before="0" w:after="80"/>
       </w:pPr>
-      <w:bookmarkStart w:id="77" w:name="_Toc244102548"/>
+      <w:bookmarkStart w:id="77" w:name="_Toc244113317"/>
       <w:r>
         <w:rPr>
           <w:b w:val="0"/>
@@ -23378,7 +22636,7 @@
         <w:keepNext/>
         <w:spacing w:before="0" w:after="80"/>
       </w:pPr>
-      <w:bookmarkStart w:id="78" w:name="_Toc244102549"/>
+      <w:bookmarkStart w:id="78" w:name="_Toc244113318"/>
       <w:r>
         <w:rPr>
           <w:b w:val="0"/>
@@ -23469,7 +22727,7 @@
         <w:keepNext/>
         <w:spacing w:before="0" w:after="80"/>
       </w:pPr>
-      <w:bookmarkStart w:id="79" w:name="_Toc244102550"/>
+      <w:bookmarkStart w:id="79" w:name="_Toc244113319"/>
       <w:r>
         <w:rPr>
           <w:b w:val="0"/>
@@ -23560,7 +22818,7 @@
         <w:keepNext/>
         <w:spacing w:before="0" w:after="80"/>
       </w:pPr>
-      <w:bookmarkStart w:id="80" w:name="_Toc244102551"/>
+      <w:bookmarkStart w:id="80" w:name="_Toc244113320"/>
       <w:r>
         <w:rPr>
           <w:b w:val="0"/>
@@ -23651,7 +22909,7 @@
         <w:keepNext/>
         <w:spacing w:before="0" w:after="80"/>
       </w:pPr>
-      <w:bookmarkStart w:id="81" w:name="_Toc244102552"/>
+      <w:bookmarkStart w:id="81" w:name="_Toc244113321"/>
       <w:r>
         <w:rPr>
           <w:b w:val="0"/>
@@ -23742,7 +23000,7 @@
         <w:keepNext/>
         <w:spacing w:before="0" w:after="80"/>
       </w:pPr>
-      <w:bookmarkStart w:id="82" w:name="_Toc244102553"/>
+      <w:bookmarkStart w:id="82" w:name="_Toc244113322"/>
       <w:r>
         <w:rPr>
           <w:b w:val="0"/>
@@ -23833,7 +23091,7 @@
         <w:keepNext/>
         <w:spacing w:before="0" w:after="80"/>
       </w:pPr>
-      <w:bookmarkStart w:id="83" w:name="_Toc244102554"/>
+      <w:bookmarkStart w:id="83" w:name="_Toc244113323"/>
       <w:r>
         <w:rPr>
           <w:b w:val="0"/>
@@ -23924,7 +23182,7 @@
         <w:keepNext/>
         <w:spacing w:before="0" w:after="80"/>
       </w:pPr>
-      <w:bookmarkStart w:id="84" w:name="_Toc244102555"/>
+      <w:bookmarkStart w:id="84" w:name="_Toc244113324"/>
       <w:r>
         <w:rPr>
           <w:b w:val="0"/>
@@ -24015,7 +23273,7 @@
         <w:keepNext/>
         <w:spacing w:before="0" w:after="80"/>
       </w:pPr>
-      <w:bookmarkStart w:id="85" w:name="_Toc244102556"/>
+      <w:bookmarkStart w:id="85" w:name="_Toc244113325"/>
       <w:r>
         <w:rPr>
           <w:b w:val="0"/>
@@ -24048,7 +23306,7 @@
       <w:pPr>
         <w:pStyle w:val="Heading1"/>
       </w:pPr>
-      <w:bookmarkStart w:id="86" w:name="_Toc244102510"/>
+      <w:bookmarkStart w:id="86" w:name="_Toc244113279"/>
       <w:r>
         <w:rPr>
           <w:b w:val="0"/>
@@ -24062,7 +23320,7 @@
       <w:pPr>
         <w:pStyle w:val="Heading2"/>
       </w:pPr>
-      <w:bookmarkStart w:id="87" w:name="_Toc244102511"/>
+      <w:bookmarkStart w:id="87" w:name="_Toc244113280"/>
       <w:r>
         <w:rPr>
           <w:b w:val="0"/>
@@ -24091,7 +23349,7 @@
       <w:pPr>
         <w:pStyle w:val="TableCaption"/>
       </w:pPr>
-      <w:bookmarkStart w:id="88" w:name="_Toc244102540"/>
+      <w:bookmarkStart w:id="88" w:name="_Toc244113309"/>
       <w:r>
         <w:rPr>
           <w:b w:val="0"/>
@@ -24712,7 +23970,7 @@
       <w:pPr>
         <w:pStyle w:val="Heading2"/>
       </w:pPr>
-      <w:bookmarkStart w:id="89" w:name="_Toc244102512"/>
+      <w:bookmarkStart w:id="89" w:name="_Toc244113281"/>
       <w:r>
         <w:rPr>
           <w:b w:val="0"/>
@@ -24781,7 +24039,7 @@
       <w:pPr>
         <w:pStyle w:val="Heading2"/>
       </w:pPr>
-      <w:bookmarkStart w:id="90" w:name="_Toc244102513"/>
+      <w:bookmarkStart w:id="90" w:name="_Toc244113282"/>
       <w:r>
         <w:rPr>
           <w:b w:val="0"/>
@@ -24802,7 +24060,7 @@
       <w:pPr>
         <w:pStyle w:val="Heading1"/>
       </w:pPr>
-      <w:bookmarkStart w:id="91" w:name="_Toc244102514"/>
+      <w:bookmarkStart w:id="91" w:name="_Toc244113283"/>
       <w:r>
         <w:rPr>
           <w:b w:val="0"/>
@@ -24880,7 +24138,7 @@
       <w:pPr>
         <w:pStyle w:val="Heading1"/>
       </w:pPr>
-      <w:bookmarkStart w:id="92" w:name="_Toc244102515"/>
+      <w:bookmarkStart w:id="92" w:name="_Toc244113284"/>
       <w:r>
         <w:rPr>
           <w:b w:val="0"/>
@@ -24894,7 +24152,7 @@
       <w:pPr>
         <w:pStyle w:val="Heading2"/>
       </w:pPr>
-      <w:bookmarkStart w:id="93" w:name="_Toc244102516"/>
+      <w:bookmarkStart w:id="93" w:name="_Toc244113285"/>
       <w:r>
         <w:rPr>
           <w:b w:val="0"/>
@@ -25189,7 +24447,7 @@
       <w:pPr>
         <w:pStyle w:val="Heading2"/>
       </w:pPr>
-      <w:bookmarkStart w:id="94" w:name="_Toc244102517"/>
+      <w:bookmarkStart w:id="94" w:name="_Toc244113286"/>
       <w:r>
         <w:rPr>
           <w:b w:val="0"/>
@@ -25203,7 +24461,7 @@
       <w:pPr>
         <w:pStyle w:val="TableCaption"/>
       </w:pPr>
-      <w:bookmarkStart w:id="95" w:name="_Toc244102541"/>
+      <w:bookmarkStart w:id="95" w:name="_Toc244113310"/>
       <w:r>
         <w:rPr>
           <w:b w:val="0"/>
@@ -26020,7 +25278,7 @@
       <w:pPr>
         <w:pStyle w:val="Heading2"/>
       </w:pPr>
-      <w:bookmarkStart w:id="96" w:name="_Toc244102518"/>
+      <w:bookmarkStart w:id="96" w:name="_Toc244113287"/>
       <w:r>
         <w:rPr>
           <w:b w:val="0"/>
@@ -26034,7 +25292,7 @@
       <w:pPr>
         <w:pStyle w:val="TableCaption"/>
       </w:pPr>
-      <w:bookmarkStart w:id="97" w:name="_Toc244102542"/>
+      <w:bookmarkStart w:id="97" w:name="_Toc244113311"/>
       <w:r>
         <w:rPr>
           <w:b w:val="0"/>
@@ -27799,7 +27057,7 @@
       <w:pPr>
         <w:pStyle w:val="TableCaption"/>
       </w:pPr>
-      <w:bookmarkStart w:id="98" w:name="_Toc244102543"/>
+      <w:bookmarkStart w:id="98" w:name="_Toc244113312"/>
       <w:r>
         <w:rPr>
           <w:b w:val="0"/>
@@ -28924,7 +28182,7 @@
       <w:pPr>
         <w:pStyle w:val="TableCaption"/>
       </w:pPr>
-      <w:bookmarkStart w:id="99" w:name="_Toc244102544"/>
+      <w:bookmarkStart w:id="99" w:name="_Toc244113313"/>
       <w:r>
         <w:rPr>
           <w:b w:val="0"/>
@@ -29280,7 +28538,7 @@
       <w:pPr>
         <w:pStyle w:val="Heading2"/>
       </w:pPr>
-      <w:bookmarkStart w:id="100" w:name="_Toc244102519"/>
+      <w:bookmarkStart w:id="100" w:name="_Toc244113288"/>
       <w:r>
         <w:rPr>
           <w:b w:val="0"/>
@@ -29302,7 +28560,7 @@
       <w:pPr>
         <w:pStyle w:val="TableCaption"/>
       </w:pPr>
-      <w:bookmarkStart w:id="101" w:name="_Toc244102545"/>
+      <w:bookmarkStart w:id="101" w:name="_Toc244113314"/>
       <w:r>
         <w:rPr>
           <w:b w:val="0"/>

</xml_diff>